<commit_message>
docs: divide a moderação em casos de uso e volta a usar include e extend
UC10 passa a ser Julgar denúncia, estendido por UC15 Remover avaliação e UC16 Suspender conta. O cálculo de rota volta como UC13 Calcular rota, incluído por UC03, e UC14 Recalcular rota, que estende UC06. RF27 foi dividido em RF27-RF29 e a RN23 define o efeito da suspensão. Documento técnico na versão 3.1.
</commit_message>
<xml_diff>
--- a/docs/documento-tecnico.docx
+++ b/docs/documento-tecnico.docx
@@ -273,7 +273,7 @@
                 <w:b w:val="0"/>
                 <w:sz w:val="19"/>
               </w:rPr>
-              <w:t>3.0 / 14 de outubro de 2026</w:t>
+              <w:t>3.1 / 20 de outubro de 2026</w:t>
             </w:r>
           </w:p>
         </w:tc>
@@ -4660,7 +4660,169 @@
                 <w:b w:val="0"/>
                 <w:sz w:val="19"/>
               </w:rPr>
-              <w:t>Permitir que o administrador consulte denúncias e registre, por meio do Django Admin, decisões de moderação sobre conteúdo e contas.</w:t>
+              <w:t>Permitir que o administrador consulte as denúncias pendentes e registre no Django Admin se cada uma procede ou não, com justificativa.</w:t>
+            </w:r>
+          </w:p>
+        </w:tc>
+        <w:tc>
+          <w:tcPr>
+            <w:tcW w:type="dxa" w:w="1304"/>
+          </w:tcPr>
+          <w:p>
+            <w:pPr>
+              <w:spacing w:after="20" w:before="20" w:line="240" w:lineRule="auto"/>
+            </w:pPr>
+            <w:r/>
+            <w:r>
+              <w:rPr>
+                <w:rFonts w:ascii="Arial" w:hAnsi="Arial"/>
+                <w:b w:val="0"/>
+                <w:sz w:val="19"/>
+              </w:rPr>
+              <w:t>Poderia ter</w:t>
+            </w:r>
+          </w:p>
+        </w:tc>
+        <w:tc>
+          <w:tcPr>
+            <w:tcW w:type="dxa" w:w="1020"/>
+          </w:tcPr>
+          <w:p>
+            <w:pPr>
+              <w:spacing w:after="20" w:before="20" w:line="240" w:lineRule="auto"/>
+            </w:pPr>
+            <w:r/>
+            <w:r>
+              <w:rPr>
+                <w:rFonts w:ascii="Arial" w:hAnsi="Arial"/>
+                <w:b w:val="0"/>
+                <w:sz w:val="19"/>
+              </w:rPr>
+              <w:t>6</w:t>
+            </w:r>
+          </w:p>
+        </w:tc>
+      </w:tr>
+      <w:tr>
+        <w:trPr>
+          <w:cantSplit/>
+        </w:trPr>
+        <w:tc>
+          <w:tcPr>
+            <w:tcW w:type="dxa" w:w="1077"/>
+          </w:tcPr>
+          <w:p>
+            <w:pPr>
+              <w:spacing w:after="20" w:before="20" w:line="240" w:lineRule="auto"/>
+            </w:pPr>
+            <w:r/>
+            <w:r>
+              <w:rPr>
+                <w:rFonts w:ascii="Arial" w:hAnsi="Arial"/>
+                <w:b w:val="0"/>
+                <w:sz w:val="19"/>
+              </w:rPr>
+              <w:t>RF28</w:t>
+            </w:r>
+          </w:p>
+        </w:tc>
+        <w:tc>
+          <w:tcPr>
+            <w:tcW w:type="dxa" w:w="5669"/>
+          </w:tcPr>
+          <w:p>
+            <w:pPr>
+              <w:spacing w:after="20" w:before="20" w:line="240" w:lineRule="auto"/>
+            </w:pPr>
+            <w:r/>
+            <w:r>
+              <w:rPr>
+                <w:rFonts w:ascii="Arial" w:hAnsi="Arial"/>
+                <w:b w:val="0"/>
+                <w:sz w:val="19"/>
+              </w:rPr>
+              <w:t>Permitir que o administrador remova uma avaliação considerada indevida, retirando-a do perfil e do cálculo da reputação.</w:t>
+            </w:r>
+          </w:p>
+        </w:tc>
+        <w:tc>
+          <w:tcPr>
+            <w:tcW w:type="dxa" w:w="1304"/>
+          </w:tcPr>
+          <w:p>
+            <w:pPr>
+              <w:spacing w:after="20" w:before="20" w:line="240" w:lineRule="auto"/>
+            </w:pPr>
+            <w:r/>
+            <w:r>
+              <w:rPr>
+                <w:rFonts w:ascii="Arial" w:hAnsi="Arial"/>
+                <w:b w:val="0"/>
+                <w:sz w:val="19"/>
+              </w:rPr>
+              <w:t>Poderia ter</w:t>
+            </w:r>
+          </w:p>
+        </w:tc>
+        <w:tc>
+          <w:tcPr>
+            <w:tcW w:type="dxa" w:w="1020"/>
+          </w:tcPr>
+          <w:p>
+            <w:pPr>
+              <w:spacing w:after="20" w:before="20" w:line="240" w:lineRule="auto"/>
+            </w:pPr>
+            <w:r/>
+            <w:r>
+              <w:rPr>
+                <w:rFonts w:ascii="Arial" w:hAnsi="Arial"/>
+                <w:b w:val="0"/>
+                <w:sz w:val="19"/>
+              </w:rPr>
+              <w:t>6</w:t>
+            </w:r>
+          </w:p>
+        </w:tc>
+      </w:tr>
+      <w:tr>
+        <w:trPr>
+          <w:cantSplit/>
+        </w:trPr>
+        <w:tc>
+          <w:tcPr>
+            <w:tcW w:type="dxa" w:w="1077"/>
+          </w:tcPr>
+          <w:p>
+            <w:pPr>
+              <w:spacing w:after="20" w:before="20" w:line="240" w:lineRule="auto"/>
+            </w:pPr>
+            <w:r/>
+            <w:r>
+              <w:rPr>
+                <w:rFonts w:ascii="Arial" w:hAnsi="Arial"/>
+                <w:b w:val="0"/>
+                <w:sz w:val="19"/>
+              </w:rPr>
+              <w:t>RF29</w:t>
+            </w:r>
+          </w:p>
+        </w:tc>
+        <w:tc>
+          <w:tcPr>
+            <w:tcW w:type="dxa" w:w="5669"/>
+          </w:tcPr>
+          <w:p>
+            <w:pPr>
+              <w:spacing w:after="20" w:before="20" w:line="240" w:lineRule="auto"/>
+            </w:pPr>
+            <w:r/>
+            <w:r>
+              <w:rPr>
+                <w:rFonts w:ascii="Arial" w:hAnsi="Arial"/>
+                <w:b w:val="0"/>
+                <w:sz w:val="19"/>
+              </w:rPr>
+              <w:t>Permitir que o administrador suspenda a conta de um estudante, informando o motivo e, quando houver, o prazo da suspensão.</w:t>
             </w:r>
           </w:p>
         </w:tc>
@@ -4714,7 +4876,7 @@
         <w:jc w:val="both"/>
       </w:pPr>
       <w:r>
-        <w:t>Resumo: 12 requisitos classificados como Deve ter, 10 como Deveria ter e 5 como Poderia ter.</w:t>
+        <w:t>Resumo: 12 requisitos classificados como Deve ter, 10 como Deveria ter e 7 como Poderia ter.</w:t>
       </w:r>
     </w:p>
     <w:p>
@@ -7217,7 +7379,7 @@
                 <w:b w:val="0"/>
                 <w:sz w:val="19"/>
               </w:rPr>
-              <w:t>RF25, RF27</w:t>
+              <w:t>RF25, RF28</w:t>
             </w:r>
           </w:p>
         </w:tc>
@@ -7279,7 +7441,69 @@
                 <w:b w:val="0"/>
                 <w:sz w:val="19"/>
               </w:rPr>
-              <w:t>RF26-RF27</w:t>
+              <w:t>RF26-RF29</w:t>
+            </w:r>
+          </w:p>
+        </w:tc>
+      </w:tr>
+      <w:tr>
+        <w:trPr>
+          <w:cantSplit/>
+        </w:trPr>
+        <w:tc>
+          <w:tcPr>
+            <w:tcW w:type="dxa" w:w="1474"/>
+          </w:tcPr>
+          <w:p>
+            <w:pPr>
+              <w:spacing w:after="20" w:before="20" w:line="240" w:lineRule="auto"/>
+            </w:pPr>
+            <w:r/>
+            <w:r>
+              <w:rPr>
+                <w:rFonts w:ascii="Arial" w:hAnsi="Arial"/>
+                <w:b w:val="0"/>
+                <w:sz w:val="19"/>
+              </w:rPr>
+              <w:t>RN23</w:t>
+            </w:r>
+          </w:p>
+        </w:tc>
+        <w:tc>
+          <w:tcPr>
+            <w:tcW w:type="dxa" w:w="5329"/>
+          </w:tcPr>
+          <w:p>
+            <w:pPr>
+              <w:spacing w:after="20" w:before="20" w:line="240" w:lineRule="auto"/>
+            </w:pPr>
+            <w:r/>
+            <w:r>
+              <w:rPr>
+                <w:rFonts w:ascii="Arial" w:hAnsi="Arial"/>
+                <w:b w:val="0"/>
+                <w:sz w:val="19"/>
+              </w:rPr>
+              <w:t>Uma conta suspensa não pode entrar no BoraJunto enquanto durar a suspensão, mesmo com o SUAP válido. As caronas futuras em que ela é motorista e as reservas dela são canceladas, e os demais participantes são notificados.</w:t>
+            </w:r>
+          </w:p>
+        </w:tc>
+        <w:tc>
+          <w:tcPr>
+            <w:tcW w:type="dxa" w:w="2268"/>
+          </w:tcPr>
+          <w:p>
+            <w:pPr>
+              <w:spacing w:after="20" w:before="20" w:line="240" w:lineRule="auto"/>
+            </w:pPr>
+            <w:r/>
+            <w:r>
+              <w:rPr>
+                <w:rFonts w:ascii="Arial" w:hAnsi="Arial"/>
+                <w:b w:val="0"/>
+                <w:sz w:val="19"/>
+              </w:rPr>
+              <w:t>RF07, RF18, RF21, RF29</w:t>
             </w:r>
           </w:p>
         </w:tc>
@@ -7326,7 +7550,7 @@
       <w:r>
         <w:drawing>
           <wp:inline xmlns:a="http://schemas.openxmlformats.org/drawingml/2006/main" xmlns:pic="http://schemas.openxmlformats.org/drawingml/2006/picture">
-            <wp:extent cx="5760000" cy="6588800"/>
+            <wp:extent cx="5760000" cy="7200000"/>
             <wp:docPr id="1" name="Picture 1"/>
             <wp:cNvGraphicFramePr>
               <a:graphicFrameLocks noChangeAspect="1"/>
@@ -7335,11 +7559,11 @@
               <a:graphicData uri="http://schemas.openxmlformats.org/drawingml/2006/picture">
                 <pic:pic>
                   <pic:nvPicPr>
-                    <pic:cNvPr id="0" name="diagrama.png"/>
+                    <pic:cNvPr id="0" name="diagrama-casos-de-uso.png"/>
                     <pic:cNvPicPr/>
                   </pic:nvPicPr>
                   <pic:blipFill>
-                    <a:blip r:embed="rId9"/>
+                    <a:blip r:embed="rId10"/>
                     <a:stretch>
                       <a:fillRect/>
                     </a:stretch>
@@ -7347,7 +7571,7 @@
                   <pic:spPr>
                     <a:xfrm>
                       <a:off x="0" y="0"/>
-                      <a:ext cx="5760000" cy="6588800"/>
+                      <a:ext cx="5760000" cy="7200000"/>
                     </a:xfrm>
                     <a:prstGeom prst="rect"/>
                   </pic:spPr>
@@ -7379,7 +7603,7 @@
         <w:jc w:val="both"/>
       </w:pPr>
       <w:r>
-        <w:t>Os casos de uso ficam direto dentro do sistema, sem pacotes, e estão dispostos em grupos por assunto: conta e comunidade, oferta de caronas, participação em caronas e moderação. As associações entre atores e casos de uso são linhas simples, sem seta. A única seta do diagrama é a de generalização (triângulo vazado), que indica a hierarquia entre Motorista, Passageiro e Estudante.</w:t>
+        <w:t>Os casos de uso ficam direto dentro do sistema, sem pacotes, e estão dispostos em grupos por assunto: conta e comunidade, oferta de caronas, participação em caronas e moderação. As associações entre atores e casos de uso são linhas simples, sem seta. Há setas apenas na generalização (triângulo vazado), que indica a hierarquia entre Motorista, Passageiro e Estudante, e nas dependências «include» e «extend», desenhadas tracejadas e com ponta aberta.</w:t>
       </w:r>
     </w:p>
     <w:p>
@@ -7387,7 +7611,7 @@
         <w:jc w:val="both"/>
       </w:pPr>
       <w:r>
-        <w:t>O diagrama não usa «include» nem «extend». O cálculo e o recálculo da rota pelo Google Maps não entregam um resultado próprio ao ator, então fazem parte dos fluxos de UC03 Publicar carona e UC06 Atualizar carona, e não aparecem como casos de uso separados. O Google Maps fornece dados geográficos; as decisões de publicação, reserva e edição permanecem no BoraJunto.</w:t>
+        <w:t>«include» indica um comportamento que sempre faz parte do caso base: publicar uma carona (UC03) sempre calcula a rota (UC13). «extend» indica um comportamento opcional, que só acontece quando a condição do ponto de extensão do caso base é atendida: UC14 Recalcular rota estende UC06 Atualizar carona quando um local muda, e UC15 Remover avaliação e UC16 Suspender conta estendem UC10 Julgar denúncia quando a denúncia procede. A seta vai do caso que inclui para o incluído e do caso que estende para o caso base. O Google Maps se associa só aos casos que o consultam (UC13 e UC14) e fornece dados geográficos; as decisões de publicação, reserva e edição permanecem no BoraJunto.</w:t>
       </w:r>
     </w:p>
     <w:p>
@@ -7395,7 +7619,7 @@
         <w:jc w:val="both"/>
       </w:pPr>
       <w:r>
-        <w:t>Os números dos casos de uso são fixos. UC11 e UC12 surgiram ao separar objetivos que estavam juntos em UC06 e UC07, e por isso aparecem no fim da numeração.</w:t>
+        <w:t>Os números dos casos de uso são fixos. UC11 e UC12 surgiram ao separar objetivos que estavam juntos em UC06 e UC07, e UC13 a UC16 ao destacar o cálculo da rota e as medidas de moderação; por isso aparecem no fim da numeração.</w:t>
       </w:r>
     </w:p>
     <w:p>
@@ -8711,7 +8935,7 @@
                 <w:b w:val="0"/>
                 <w:sz w:val="19"/>
               </w:rPr>
-              <w:t>Motorista; Google Maps</w:t>
+              <w:t>Motorista</w:t>
             </w:r>
           </w:p>
         </w:tc>
@@ -8893,63 +9117,49 @@
                 <w:b w:val="0"/>
                 <w:sz w:val="19"/>
               </w:rPr>
-              <w:t>3. O sistema envia os locais ao Google Maps.</w:t>
-            </w:r>
-          </w:p>
-          <w:p>
-            <w:pPr>
-              <w:keepNext/>
-              <w:spacing w:after="20" w:before="20" w:line="240" w:lineRule="auto"/>
-            </w:pPr>
-            <w:r>
-              <w:rPr>
-                <w:rFonts w:ascii="Arial" w:hAnsi="Arial"/>
-                <w:b w:val="0"/>
-                <w:sz w:val="19"/>
-              </w:rPr>
-              <w:t>4. O Google Maps devolve os locais validados, a rota, a distância e a duração estimada.</w:t>
-            </w:r>
-          </w:p>
-          <w:p>
-            <w:pPr>
-              <w:keepNext/>
-              <w:spacing w:after="20" w:before="20" w:line="240" w:lineRule="auto"/>
-            </w:pPr>
-            <w:r>
-              <w:rPr>
-                <w:rFonts w:ascii="Arial" w:hAnsi="Arial"/>
-                <w:b w:val="0"/>
-                <w:sz w:val="19"/>
-              </w:rPr>
-              <w:t>5. O sistema apresenta o mapa e o resumo da carona.</w:t>
-            </w:r>
-          </w:p>
-          <w:p>
-            <w:pPr>
-              <w:keepNext/>
-              <w:spacing w:after="20" w:before="20" w:line="240" w:lineRule="auto"/>
-            </w:pPr>
-            <w:r>
-              <w:rPr>
-                <w:rFonts w:ascii="Arial" w:hAnsi="Arial"/>
-                <w:b w:val="0"/>
-                <w:sz w:val="19"/>
-              </w:rPr>
-              <w:t>6. O motorista confere o resumo e confirma.</w:t>
-            </w:r>
-          </w:p>
-          <w:p>
-            <w:pPr>
-              <w:keepNext/>
-              <w:spacing w:after="20" w:before="20" w:line="240" w:lineRule="auto"/>
-            </w:pPr>
-            <w:r>
-              <w:rPr>
-                <w:rFonts w:ascii="Arial" w:hAnsi="Arial"/>
-                <w:b w:val="0"/>
-                <w:sz w:val="19"/>
-              </w:rPr>
-              <w:t>7. O sistema valida os dados e publica a carona.</w:t>
+              <w:t>3. O sistema executa UC13 Calcular rota («include»).</w:t>
+            </w:r>
+          </w:p>
+          <w:p>
+            <w:pPr>
+              <w:keepNext/>
+              <w:spacing w:after="20" w:before="20" w:line="240" w:lineRule="auto"/>
+            </w:pPr>
+            <w:r>
+              <w:rPr>
+                <w:rFonts w:ascii="Arial" w:hAnsi="Arial"/>
+                <w:b w:val="0"/>
+                <w:sz w:val="19"/>
+              </w:rPr>
+              <w:t>4. O sistema apresenta o mapa e o resumo da carona.</w:t>
+            </w:r>
+          </w:p>
+          <w:p>
+            <w:pPr>
+              <w:keepNext/>
+              <w:spacing w:after="20" w:before="20" w:line="240" w:lineRule="auto"/>
+            </w:pPr>
+            <w:r>
+              <w:rPr>
+                <w:rFonts w:ascii="Arial" w:hAnsi="Arial"/>
+                <w:b w:val="0"/>
+                <w:sz w:val="19"/>
+              </w:rPr>
+              <w:t>5. O motorista confere o resumo e confirma.</w:t>
+            </w:r>
+          </w:p>
+          <w:p>
+            <w:pPr>
+              <w:keepNext/>
+              <w:spacing w:after="20" w:before="20" w:line="240" w:lineRule="auto"/>
+            </w:pPr>
+            <w:r>
+              <w:rPr>
+                <w:rFonts w:ascii="Arial" w:hAnsi="Arial"/>
+                <w:b w:val="0"/>
+                <w:sz w:val="19"/>
+              </w:rPr>
+              <w:t>6. O sistema valida os dados e publica a carona.</w:t>
             </w:r>
           </w:p>
         </w:tc>
@@ -8996,22 +9206,7 @@
                 <w:b w:val="0"/>
                 <w:sz w:val="19"/>
               </w:rPr>
-              <w:t>A1. O motorista altera um local antes da confirmação; o sistema consulta novamente o Google Maps e atualiza a rota.</w:t>
-            </w:r>
-          </w:p>
-          <w:p>
-            <w:pPr>
-              <w:pStyle w:val="ListBullet"/>
-              <w:keepNext/>
-              <w:spacing w:after="20" w:before="20" w:line="240" w:lineRule="auto"/>
-            </w:pPr>
-            <w:r>
-              <w:rPr>
-                <w:rFonts w:ascii="Arial" w:hAnsi="Arial"/>
-                <w:b w:val="0"/>
-                <w:sz w:val="19"/>
-              </w:rPr>
-              <w:t>A2. Havendo ponto de encontro, ele é incluído no cálculo da rota.</w:t>
+              <w:t>A1. O motorista altera um local antes da confirmação; UC13 é executado novamente.</w:t>
             </w:r>
           </w:p>
         </w:tc>
@@ -9073,22 +9268,7 @@
                 <w:b w:val="0"/>
                 <w:sz w:val="19"/>
               </w:rPr>
-              <w:t>E2. Local não encontrado: o sistema solicita correção.</w:t>
-            </w:r>
-          </w:p>
-          <w:p>
-            <w:pPr>
-              <w:pStyle w:val="ListBullet"/>
-              <w:keepNext/>
-              <w:spacing w:after="20" w:before="20" w:line="240" w:lineRule="auto"/>
-            </w:pPr>
-            <w:r>
-              <w:rPr>
-                <w:rFonts w:ascii="Arial" w:hAnsi="Arial"/>
-                <w:b w:val="0"/>
-                <w:sz w:val="19"/>
-              </w:rPr>
-              <w:t>E3. Google Maps indisponível: o sistema preserva o formulário, informa a falha e permite nova tentativa.</w:t>
+              <w:t>E2. UC13 não consegue calcular a rota: a carona não é publicada e os dados preenchidos são mantidos.</w:t>
             </w:r>
           </w:p>
         </w:tc>
@@ -9271,7 +9451,7 @@
                 <w:b w:val="0"/>
                 <w:sz w:val="19"/>
               </w:rPr>
-              <w:t>RF05, RF09-RF10, RF12; RN04-RN06, RN17-RN18</w:t>
+              <w:t>RF05, RF09; RN04-RN06, RN18</w:t>
             </w:r>
           </w:p>
         </w:tc>
@@ -10652,7 +10832,7 @@
                 <w:b w:val="0"/>
                 <w:sz w:val="19"/>
               </w:rPr>
-              <w:t>Motorista; Google Maps</w:t>
+              <w:t>Motorista</w:t>
             </w:r>
           </w:p>
         </w:tc>
@@ -10848,7 +11028,7 @@
                 <w:b w:val="0"/>
                 <w:sz w:val="19"/>
               </w:rPr>
-              <w:t>4. Se um local mudou, o sistema consulta o Google Maps e apresenta a nova rota.</w:t>
+              <w:t>4. Ponto de extensão "local alterado": se origem, destino ou ponto de encontro mudou, ocorre UC14 Recalcular rota («extend»).</w:t>
             </w:r>
           </w:p>
           <w:p>
@@ -10952,7 +11132,7 @@
                 <w:b w:val="0"/>
                 <w:sz w:val="19"/>
               </w:rPr>
-              <w:t>A2. O motorista desfaz a mudança de local e mantém a rota anterior.</w:t>
+              <w:t>A2. O motorista cancela a carona, informa o motivo e os confirmados são notificados.</w:t>
             </w:r>
           </w:p>
           <w:p>
@@ -10967,22 +11147,7 @@
                 <w:b w:val="0"/>
                 <w:sz w:val="19"/>
               </w:rPr>
-              <w:t>A3. O motorista cancela a carona, informa o motivo e os confirmados são notificados.</w:t>
-            </w:r>
-          </w:p>
-          <w:p>
-            <w:pPr>
-              <w:pStyle w:val="ListBullet"/>
-              <w:keepNext/>
-              <w:spacing w:after="20" w:before="20" w:line="240" w:lineRule="auto"/>
-            </w:pPr>
-            <w:r>
-              <w:rPr>
-                <w:rFonts w:ascii="Arial" w:hAnsi="Arial"/>
-                <w:b w:val="0"/>
-                <w:sz w:val="19"/>
-              </w:rPr>
-              <w:t>A4. No horário adequado, o motorista marca a carona como iniciada e depois concluída.</w:t>
+              <w:t>A3. No horário adequado, o motorista marca a carona como iniciada e depois concluída.</w:t>
             </w:r>
           </w:p>
         </w:tc>
@@ -11077,21 +11242,6 @@
               <w:t>E4. Vagas menores que confirmados: o sistema rejeita a alteração.</w:t>
             </w:r>
           </w:p>
-          <w:p>
-            <w:pPr>
-              <w:pStyle w:val="ListBullet"/>
-              <w:keepNext/>
-              <w:spacing w:after="20" w:before="20" w:line="240" w:lineRule="auto"/>
-            </w:pPr>
-            <w:r>
-              <w:rPr>
-                <w:rFonts w:ascii="Arial" w:hAnsi="Arial"/>
-                <w:b w:val="0"/>
-                <w:sz w:val="19"/>
-              </w:rPr>
-              <w:t>E5. Google Maps indisponível: a mudança de local não é confirmada e os demais dados permanecem preservados.</w:t>
-            </w:r>
-          </w:p>
         </w:tc>
       </w:tr>
       <w:tr>
@@ -11228,7 +11378,7 @@
                 <w:b w:val="0"/>
                 <w:sz w:val="19"/>
               </w:rPr>
-              <w:t>A rota é recalculada quando um local muda.</w:t>
+              <w:t>Quando um local muda, a rota é recalculada por UC14.</w:t>
             </w:r>
           </w:p>
           <w:p>
@@ -11287,7 +11437,7 @@
                 <w:b w:val="0"/>
                 <w:sz w:val="19"/>
               </w:rPr>
-              <w:t>RF06-RF08, RF11-RF12, RF21; RN04, RN13-RN15, RN17</w:t>
+              <w:t>RF06-RF08, RF21; RN04, RN13-RN15</w:t>
             </w:r>
           </w:p>
         </w:tc>
@@ -13128,7 +13278,7 @@
         <w:pStyle w:val="Heading3"/>
       </w:pPr>
       <w:r>
-        <w:t>UC10 - Analisar denúncias</w:t>
+        <w:t>UC10 - Julgar denúncia</w:t>
       </w:r>
     </w:p>
     <w:tbl>
@@ -13192,7 +13342,7 @@
                 <w:b/>
                 <w:sz w:val="19"/>
               </w:rPr>
-              <w:t>UC10 - Analisar denúncias</w:t>
+              <w:t>UC10 - Julgar denúncia</w:t>
             </w:r>
           </w:p>
         </w:tc>
@@ -13284,7 +13434,7 @@
                 <w:b w:val="0"/>
                 <w:sz w:val="19"/>
               </w:rPr>
-              <w:t>Como administrador, quero analisar as denúncias registradas e decidir se procedem, para tratar ocorrências de forma rastreável.</w:t>
+              <w:t>Como administrador, quero julgar cada denúncia pendente como procedente ou improcedente, para dar uma resposta justificada a quem denunciou.</w:t>
             </w:r>
           </w:p>
         </w:tc>
@@ -13334,6 +13484,22 @@
               <w:t>O administrador está autenticado e autorizado no Django Admin.</w:t>
             </w:r>
           </w:p>
+          <w:p>
+            <w:pPr>
+              <w:pStyle w:val="ListBullet"/>
+              <w:keepNext/>
+              <w:spacing w:after="20" w:before="20" w:line="240" w:lineRule="auto"/>
+            </w:pPr>
+            <w:r/>
+            <w:r>
+              <w:rPr>
+                <w:rFonts w:ascii="Arial" w:hAnsi="Arial"/>
+                <w:b w:val="0"/>
+                <w:sz w:val="19"/>
+              </w:rPr>
+              <w:t>Existe ao menos uma denúncia pendente.</w:t>
+            </w:r>
+          </w:p>
         </w:tc>
       </w:tr>
       <w:tr>
@@ -13377,77 +13543,91 @@
                 <w:b w:val="0"/>
                 <w:sz w:val="19"/>
               </w:rPr>
-              <w:t>1. O administrador acessa a lista de denúncias.</w:t>
-            </w:r>
-          </w:p>
-          <w:p>
-            <w:pPr>
-              <w:keepNext/>
-              <w:spacing w:after="20" w:before="20" w:line="240" w:lineRule="auto"/>
-            </w:pPr>
-            <w:r>
-              <w:rPr>
-                <w:rFonts w:ascii="Arial" w:hAnsi="Arial"/>
-                <w:b w:val="0"/>
-                <w:sz w:val="19"/>
-              </w:rPr>
-              <w:t>2. Seleciona uma denúncia pendente.</w:t>
-            </w:r>
-          </w:p>
-          <w:p>
-            <w:pPr>
-              <w:keepNext/>
-              <w:spacing w:after="20" w:before="20" w:line="240" w:lineRule="auto"/>
-            </w:pPr>
-            <w:r>
-              <w:rPr>
-                <w:rFonts w:ascii="Arial" w:hAnsi="Arial"/>
-                <w:b w:val="0"/>
-                <w:sz w:val="19"/>
-              </w:rPr>
-              <w:t>3. Consulta o relato e os dados relacionados.</w:t>
-            </w:r>
-          </w:p>
-          <w:p>
-            <w:pPr>
-              <w:keepNext/>
-              <w:spacing w:after="20" w:before="20" w:line="240" w:lineRule="auto"/>
-            </w:pPr>
-            <w:r>
-              <w:rPr>
-                <w:rFonts w:ascii="Arial" w:hAnsi="Arial"/>
-                <w:b w:val="0"/>
-                <w:sz w:val="19"/>
-              </w:rPr>
-              <w:t>4. Registra a decisão e a justificativa.</w:t>
-            </w:r>
-          </w:p>
-          <w:p>
-            <w:pPr>
-              <w:keepNext/>
-              <w:spacing w:after="20" w:before="20" w:line="240" w:lineRule="auto"/>
-            </w:pPr>
-            <w:r>
-              <w:rPr>
-                <w:rFonts w:ascii="Arial" w:hAnsi="Arial"/>
-                <w:b w:val="0"/>
-                <w:sz w:val="19"/>
-              </w:rPr>
-              <w:t>5. Quando necessário, oculta conteúdo ou restringe a conta.</w:t>
-            </w:r>
-          </w:p>
-          <w:p>
-            <w:pPr>
-              <w:keepNext/>
-              <w:spacing w:after="20" w:before="20" w:line="240" w:lineRule="auto"/>
-            </w:pPr>
-            <w:r>
-              <w:rPr>
-                <w:rFonts w:ascii="Arial" w:hAnsi="Arial"/>
-                <w:b w:val="0"/>
-                <w:sz w:val="19"/>
-              </w:rPr>
-              <w:t>6. O sistema registra a ação administrativa.</w:t>
+              <w:t>1. O administrador abre a lista de denúncias pendentes.</w:t>
+            </w:r>
+          </w:p>
+          <w:p>
+            <w:pPr>
+              <w:keepNext/>
+              <w:spacing w:after="20" w:before="20" w:line="240" w:lineRule="auto"/>
+            </w:pPr>
+            <w:r>
+              <w:rPr>
+                <w:rFonts w:ascii="Arial" w:hAnsi="Arial"/>
+                <w:b w:val="0"/>
+                <w:sz w:val="19"/>
+              </w:rPr>
+              <w:t>2. Seleciona uma denúncia.</w:t>
+            </w:r>
+          </w:p>
+          <w:p>
+            <w:pPr>
+              <w:keepNext/>
+              <w:spacing w:after="20" w:before="20" w:line="240" w:lineRule="auto"/>
+            </w:pPr>
+            <w:r>
+              <w:rPr>
+                <w:rFonts w:ascii="Arial" w:hAnsi="Arial"/>
+                <w:b w:val="0"/>
+                <w:sz w:val="19"/>
+              </w:rPr>
+              <w:t>3. O sistema mostra o relato, o denunciante e o alvo: usuário, carona ou avaliação.</w:t>
+            </w:r>
+          </w:p>
+          <w:p>
+            <w:pPr>
+              <w:keepNext/>
+              <w:spacing w:after="20" w:before="20" w:line="240" w:lineRule="auto"/>
+            </w:pPr>
+            <w:r>
+              <w:rPr>
+                <w:rFonts w:ascii="Arial" w:hAnsi="Arial"/>
+                <w:b w:val="0"/>
+                <w:sz w:val="19"/>
+              </w:rPr>
+              <w:t>4. O administrador marca a denúncia como procedente ou improcedente e escreve a justificativa.</w:t>
+            </w:r>
+          </w:p>
+          <w:p>
+            <w:pPr>
+              <w:keepNext/>
+              <w:spacing w:after="20" w:before="20" w:line="240" w:lineRule="auto"/>
+            </w:pPr>
+            <w:r>
+              <w:rPr>
+                <w:rFonts w:ascii="Arial" w:hAnsi="Arial"/>
+                <w:b w:val="0"/>
+                <w:sz w:val="19"/>
+              </w:rPr>
+              <w:t>5. Ponto de extensão "aplicar medida": se a denúncia procede, pode ocorrer UC15 Remover avaliação ou UC16 Suspender conta («extend»).</w:t>
+            </w:r>
+          </w:p>
+          <w:p>
+            <w:pPr>
+              <w:keepNext/>
+              <w:spacing w:after="20" w:before="20" w:line="240" w:lineRule="auto"/>
+            </w:pPr>
+            <w:r>
+              <w:rPr>
+                <w:rFonts w:ascii="Arial" w:hAnsi="Arial"/>
+                <w:b w:val="0"/>
+                <w:sz w:val="19"/>
+              </w:rPr>
+              <w:t>6. O sistema registra a decisão, a data e o administrador responsável.</w:t>
+            </w:r>
+          </w:p>
+          <w:p>
+            <w:pPr>
+              <w:keepNext/>
+              <w:spacing w:after="20" w:before="20" w:line="240" w:lineRule="auto"/>
+            </w:pPr>
+            <w:r>
+              <w:rPr>
+                <w:rFonts w:ascii="Arial" w:hAnsi="Arial"/>
+                <w:b w:val="0"/>
+                <w:sz w:val="19"/>
+              </w:rPr>
+              <w:t>7. O sistema notifica o denunciante de que a denúncia foi julgada.</w:t>
             </w:r>
           </w:p>
         </w:tc>
@@ -13494,7 +13674,23 @@
                 <w:b w:val="0"/>
                 <w:sz w:val="19"/>
               </w:rPr>
-              <w:t>A1. A denúncia é considerada improcedente e encerrada com justificativa.</w:t>
+              <w:t>A1. A denúncia é improcedente: nenhuma medida é aplicada e o julgamento é encerrado com a justificativa.</w:t>
+            </w:r>
+          </w:p>
+          <w:p>
+            <w:pPr>
+              <w:pStyle w:val="ListBullet"/>
+              <w:keepNext/>
+              <w:spacing w:after="20" w:before="20" w:line="240" w:lineRule="auto"/>
+            </w:pPr>
+            <w:r/>
+            <w:r>
+              <w:rPr>
+                <w:rFonts w:ascii="Arial" w:hAnsi="Arial"/>
+                <w:b w:val="0"/>
+                <w:sz w:val="19"/>
+              </w:rPr>
+              <w:t>A2. Várias denúncias sobre o mesmo alvo podem ser julgadas juntas, com a mesma justificativa.</w:t>
             </w:r>
           </w:p>
         </w:tc>
@@ -13556,7 +13752,22 @@
                 <w:b w:val="0"/>
                 <w:sz w:val="19"/>
               </w:rPr>
-              <w:t>E2. Falha ao registrar auditoria: a decisão não é concluída.</w:t>
+              <w:t>E2. Justificativa vazia: a decisão não é salva.</w:t>
+            </w:r>
+          </w:p>
+          <w:p>
+            <w:pPr>
+              <w:pStyle w:val="ListBullet"/>
+              <w:keepNext/>
+              <w:spacing w:after="20" w:before="20" w:line="240" w:lineRule="auto"/>
+            </w:pPr>
+            <w:r>
+              <w:rPr>
+                <w:rFonts w:ascii="Arial" w:hAnsi="Arial"/>
+                <w:b w:val="0"/>
+                <w:sz w:val="19"/>
+              </w:rPr>
+              <w:t>E3. Denúncia já julgada: o sistema não permite um segundo julgamento.</w:t>
             </w:r>
           </w:p>
         </w:tc>
@@ -13603,7 +13814,7 @@
                 <w:b w:val="0"/>
                 <w:sz w:val="19"/>
               </w:rPr>
-              <w:t>A decisão e sua justificativa ficam registradas em auditoria.</w:t>
+              <w:t>A denúncia sai da lista de pendentes, com decisão e justificativa registradas.</w:t>
             </w:r>
           </w:p>
         </w:tc>
@@ -13650,7 +13861,7 @@
                 <w:b w:val="0"/>
                 <w:sz w:val="19"/>
               </w:rPr>
-              <w:t>O acesso ocorre pelo Django Admin.</w:t>
+              <w:t>Somente administradores autorizados acessam as denúncias, pelo Django Admin.</w:t>
             </w:r>
           </w:p>
           <w:p>
@@ -13680,7 +13891,22 @@
                 <w:b w:val="0"/>
                 <w:sz w:val="19"/>
               </w:rPr>
-              <w:t>A ação administrativa fica registrada em auditoria.</w:t>
+              <w:t>Uma denúncia julgada não volta a ficar pendente.</w:t>
+            </w:r>
+          </w:p>
+          <w:p>
+            <w:pPr>
+              <w:pStyle w:val="ListBullet"/>
+              <w:keepNext/>
+              <w:spacing w:after="20" w:before="20" w:line="240" w:lineRule="auto"/>
+            </w:pPr>
+            <w:r>
+              <w:rPr>
+                <w:rFonts w:ascii="Arial" w:hAnsi="Arial"/>
+                <w:b w:val="0"/>
+                <w:sz w:val="19"/>
+              </w:rPr>
+              <w:t>Julgar não aplica medidas sozinho: remover avaliação e suspender conta são passos separados.</w:t>
             </w:r>
           </w:p>
         </w:tc>
@@ -13724,7 +13950,7 @@
                 <w:b w:val="0"/>
                 <w:sz w:val="19"/>
               </w:rPr>
-              <w:t>RF27; RN21-RN22; RNF12</w:t>
+              <w:t>RF27; RN22; RNF12</w:t>
             </w:r>
           </w:p>
         </w:tc>
@@ -14783,7 +15009,7 @@
                 <w:b w:val="0"/>
                 <w:sz w:val="19"/>
               </w:rPr>
-              <w:t>E1. A carona foi ocultada pela moderação: ela aparece como indisponível.</w:t>
+              <w:t>E1. O motorista da carona teve a conta suspensa: a carona aparece como cancelada.</w:t>
             </w:r>
           </w:p>
         </w:tc>
@@ -14937,6 +15163,2324 @@
                 <w:sz w:val="19"/>
               </w:rPr>
               <w:t>RF23; RN03, RN15</w:t>
+            </w:r>
+          </w:p>
+        </w:tc>
+      </w:tr>
+    </w:tbl>
+    <w:p>
+      <w:pPr>
+        <w:pStyle w:val="Heading3"/>
+      </w:pPr>
+      <w:r>
+        <w:t>UC13 - Calcular rota</w:t>
+      </w:r>
+    </w:p>
+    <w:tbl>
+      <w:tblPr>
+        <w:tblW w:type="auto" w:w="0"/>
+        <w:jc w:val="center"/>
+        <w:tblLayout w:type="fixed"/>
+        <w:tblLook w:firstColumn="1" w:firstRow="1" w:lastColumn="0" w:lastRow="0" w:noHBand="0" w:noVBand="1" w:val="04A0"/>
+        <w:tblBorders>
+          <w:top w:val="single" w:sz="8" w:color="000000"/>
+          <w:left w:val="single" w:sz="8" w:color="000000"/>
+          <w:bottom w:val="single" w:sz="8" w:color="000000"/>
+          <w:right w:val="single" w:sz="8" w:color="000000"/>
+          <w:insideH w:val="single" w:sz="8" w:color="000000"/>
+          <w:insideV w:val="single" w:sz="8" w:color="000000"/>
+        </w:tblBorders>
+      </w:tblPr>
+      <w:tblGrid>
+        <w:gridCol w:w="2948"/>
+        <w:gridCol w:w="6123"/>
+      </w:tblGrid>
+      <w:tr>
+        <w:trPr>
+          <w:cantSplit/>
+        </w:trPr>
+        <w:tc>
+          <w:tcPr>
+            <w:tcW w:type="dxa" w:w="2948"/>
+            <w:shd w:val="clear" w:color="auto" w:fill="D9E8F5"/>
+          </w:tcPr>
+          <w:p>
+            <w:pPr>
+              <w:keepNext/>
+              <w:spacing w:after="20" w:before="20" w:line="240" w:lineRule="auto"/>
+            </w:pPr>
+            <w:r/>
+            <w:r>
+              <w:rPr>
+                <w:rFonts w:ascii="Arial" w:hAnsi="Arial"/>
+                <w:b/>
+                <w:sz w:val="19"/>
+              </w:rPr>
+              <w:t>Caso de Uso</w:t>
+            </w:r>
+          </w:p>
+        </w:tc>
+        <w:tc>
+          <w:tcPr>
+            <w:tcW w:type="dxa" w:w="6123"/>
+            <w:shd w:val="clear" w:color="auto" w:fill="D9E8F5"/>
+          </w:tcPr>
+          <w:p>
+            <w:pPr>
+              <w:keepNext/>
+              <w:spacing w:after="20" w:before="20" w:line="240" w:lineRule="auto"/>
+            </w:pPr>
+            <w:r/>
+            <w:r>
+              <w:rPr>
+                <w:rFonts w:ascii="Arial" w:hAnsi="Arial"/>
+                <w:b/>
+                <w:sz w:val="19"/>
+              </w:rPr>
+              <w:t>UC13 - Calcular rota</w:t>
+            </w:r>
+          </w:p>
+        </w:tc>
+      </w:tr>
+      <w:tr>
+        <w:trPr>
+          <w:cantSplit/>
+        </w:trPr>
+        <w:tc>
+          <w:tcPr>
+            <w:tcW w:type="dxa" w:w="2948"/>
+            <w:shd w:val="clear" w:color="auto" w:fill="D9E8F5"/>
+          </w:tcPr>
+          <w:p>
+            <w:pPr>
+              <w:keepNext/>
+              <w:spacing w:after="20" w:before="20" w:line="240" w:lineRule="auto"/>
+            </w:pPr>
+            <w:r/>
+            <w:r>
+              <w:rPr>
+                <w:rFonts w:ascii="Arial" w:hAnsi="Arial"/>
+                <w:b/>
+                <w:sz w:val="19"/>
+              </w:rPr>
+              <w:t>Ator(es)</w:t>
+            </w:r>
+          </w:p>
+        </w:tc>
+        <w:tc>
+          <w:tcPr>
+            <w:tcW w:type="dxa" w:w="6123"/>
+          </w:tcPr>
+          <w:p>
+            <w:pPr>
+              <w:keepNext/>
+              <w:spacing w:after="20" w:before="20" w:line="240" w:lineRule="auto"/>
+            </w:pPr>
+            <w:r/>
+            <w:r>
+              <w:rPr>
+                <w:rFonts w:ascii="Arial" w:hAnsi="Arial"/>
+                <w:b w:val="0"/>
+                <w:sz w:val="19"/>
+              </w:rPr>
+              <w:t>Google Maps</w:t>
+            </w:r>
+          </w:p>
+        </w:tc>
+      </w:tr>
+      <w:tr>
+        <w:trPr>
+          <w:cantSplit/>
+        </w:trPr>
+        <w:tc>
+          <w:tcPr>
+            <w:tcW w:type="dxa" w:w="2948"/>
+            <w:shd w:val="clear" w:color="auto" w:fill="D9E8F5"/>
+          </w:tcPr>
+          <w:p>
+            <w:pPr>
+              <w:keepNext/>
+              <w:spacing w:after="20" w:before="20" w:line="240" w:lineRule="auto"/>
+            </w:pPr>
+            <w:r/>
+            <w:r>
+              <w:rPr>
+                <w:rFonts w:ascii="Arial" w:hAnsi="Arial"/>
+                <w:b/>
+                <w:sz w:val="19"/>
+              </w:rPr>
+              <w:t>História de usuário</w:t>
+            </w:r>
+          </w:p>
+        </w:tc>
+        <w:tc>
+          <w:tcPr>
+            <w:tcW w:type="dxa" w:w="6123"/>
+          </w:tcPr>
+          <w:p>
+            <w:pPr>
+              <w:keepNext/>
+              <w:spacing w:after="20" w:before="20" w:line="240" w:lineRule="auto"/>
+            </w:pPr>
+            <w:r/>
+            <w:r>
+              <w:rPr>
+                <w:rFonts w:ascii="Arial" w:hAnsi="Arial"/>
+                <w:b w:val="0"/>
+                <w:sz w:val="19"/>
+              </w:rPr>
+              <w:t>Como motorista, quero ver a rota, a distância e a duração antes de publicar, para conferir se o trajeto está correto.</w:t>
+            </w:r>
+          </w:p>
+        </w:tc>
+      </w:tr>
+      <w:tr>
+        <w:trPr>
+          <w:cantSplit/>
+        </w:trPr>
+        <w:tc>
+          <w:tcPr>
+            <w:tcW w:type="dxa" w:w="2948"/>
+            <w:shd w:val="clear" w:color="auto" w:fill="D9E8F5"/>
+          </w:tcPr>
+          <w:p>
+            <w:pPr>
+              <w:keepNext/>
+              <w:spacing w:after="20" w:before="20" w:line="240" w:lineRule="auto"/>
+            </w:pPr>
+            <w:r/>
+            <w:r>
+              <w:rPr>
+                <w:rFonts w:ascii="Arial" w:hAnsi="Arial"/>
+                <w:b/>
+                <w:sz w:val="19"/>
+              </w:rPr>
+              <w:t>Pré-requisitos</w:t>
+            </w:r>
+          </w:p>
+        </w:tc>
+        <w:tc>
+          <w:tcPr>
+            <w:tcW w:type="dxa" w:w="6123"/>
+          </w:tcPr>
+          <w:p>
+            <w:pPr>
+              <w:pStyle w:val="ListBullet"/>
+              <w:keepNext/>
+              <w:spacing w:after="20" w:before="20" w:line="240" w:lineRule="auto"/>
+            </w:pPr>
+            <w:r/>
+            <w:r>
+              <w:rPr>
+                <w:rFonts w:ascii="Arial" w:hAnsi="Arial"/>
+                <w:b w:val="0"/>
+                <w:sz w:val="19"/>
+              </w:rPr>
+              <w:t>É incluído por UC03 Publicar carona, depois que origem e destino foram informados.</w:t>
+            </w:r>
+          </w:p>
+          <w:p>
+            <w:pPr>
+              <w:pStyle w:val="ListBullet"/>
+              <w:keepNext/>
+              <w:spacing w:after="20" w:before="20" w:line="240" w:lineRule="auto"/>
+            </w:pPr>
+            <w:r/>
+            <w:r>
+              <w:rPr>
+                <w:rFonts w:ascii="Arial" w:hAnsi="Arial"/>
+                <w:b w:val="0"/>
+                <w:sz w:val="19"/>
+              </w:rPr>
+              <w:t>A chave da API do Google Maps está configurada.</w:t>
+            </w:r>
+          </w:p>
+        </w:tc>
+      </w:tr>
+      <w:tr>
+        <w:trPr>
+          <w:cantSplit/>
+        </w:trPr>
+        <w:tc>
+          <w:tcPr>
+            <w:tcW w:type="dxa" w:w="2948"/>
+            <w:shd w:val="clear" w:color="auto" w:fill="D9E8F5"/>
+          </w:tcPr>
+          <w:p>
+            <w:pPr>
+              <w:keepNext/>
+              <w:spacing w:after="20" w:before="20" w:line="240" w:lineRule="auto"/>
+            </w:pPr>
+            <w:r/>
+            <w:r>
+              <w:rPr>
+                <w:rFonts w:ascii="Arial" w:hAnsi="Arial"/>
+                <w:b/>
+                <w:sz w:val="19"/>
+              </w:rPr>
+              <w:t>Fluxo Principal</w:t>
+            </w:r>
+          </w:p>
+        </w:tc>
+        <w:tc>
+          <w:tcPr>
+            <w:tcW w:type="dxa" w:w="6123"/>
+          </w:tcPr>
+          <w:p>
+            <w:pPr>
+              <w:keepNext/>
+              <w:spacing w:after="20" w:before="20" w:line="240" w:lineRule="auto"/>
+            </w:pPr>
+            <w:r/>
+            <w:r>
+              <w:rPr>
+                <w:rFonts w:ascii="Arial" w:hAnsi="Arial"/>
+                <w:b w:val="0"/>
+                <w:sz w:val="19"/>
+              </w:rPr>
+              <w:t>1. O sistema envia origem, destino e ponto de encontro ao Google Maps.</w:t>
+            </w:r>
+          </w:p>
+          <w:p>
+            <w:pPr>
+              <w:keepNext/>
+              <w:spacing w:after="20" w:before="20" w:line="240" w:lineRule="auto"/>
+            </w:pPr>
+            <w:r>
+              <w:rPr>
+                <w:rFonts w:ascii="Arial" w:hAnsi="Arial"/>
+                <w:b w:val="0"/>
+                <w:sz w:val="19"/>
+              </w:rPr>
+              <w:t>2. O Google Maps devolve os locais validados, a rota, a distância e a duração estimada.</w:t>
+            </w:r>
+          </w:p>
+          <w:p>
+            <w:pPr>
+              <w:keepNext/>
+              <w:spacing w:after="20" w:before="20" w:line="240" w:lineRule="auto"/>
+            </w:pPr>
+            <w:r>
+              <w:rPr>
+                <w:rFonts w:ascii="Arial" w:hAnsi="Arial"/>
+                <w:b w:val="0"/>
+                <w:sz w:val="19"/>
+              </w:rPr>
+              <w:t>3. O sistema guarda os dados e mostra o mapa com o resumo.</w:t>
+            </w:r>
+          </w:p>
+          <w:p>
+            <w:pPr>
+              <w:keepNext/>
+              <w:spacing w:after="20" w:before="20" w:line="240" w:lineRule="auto"/>
+            </w:pPr>
+            <w:r>
+              <w:rPr>
+                <w:rFonts w:ascii="Arial" w:hAnsi="Arial"/>
+                <w:b w:val="0"/>
+                <w:sz w:val="19"/>
+              </w:rPr>
+              <w:t>4. O fluxo volta para UC03.</w:t>
+            </w:r>
+          </w:p>
+        </w:tc>
+      </w:tr>
+      <w:tr>
+        <w:trPr>
+          <w:cantSplit/>
+        </w:trPr>
+        <w:tc>
+          <w:tcPr>
+            <w:tcW w:type="dxa" w:w="2948"/>
+            <w:shd w:val="clear" w:color="auto" w:fill="D9E8F5"/>
+          </w:tcPr>
+          <w:p>
+            <w:pPr>
+              <w:keepNext/>
+              <w:spacing w:after="20" w:before="20" w:line="240" w:lineRule="auto"/>
+            </w:pPr>
+            <w:r/>
+            <w:r>
+              <w:rPr>
+                <w:rFonts w:ascii="Arial" w:hAnsi="Arial"/>
+                <w:b/>
+                <w:sz w:val="19"/>
+              </w:rPr>
+              <w:t>Fluxos Alternativos</w:t>
+            </w:r>
+          </w:p>
+        </w:tc>
+        <w:tc>
+          <w:tcPr>
+            <w:tcW w:type="dxa" w:w="6123"/>
+          </w:tcPr>
+          <w:p>
+            <w:pPr>
+              <w:pStyle w:val="ListBullet"/>
+              <w:keepNext/>
+              <w:spacing w:after="20" w:before="20" w:line="240" w:lineRule="auto"/>
+            </w:pPr>
+            <w:r/>
+            <w:r>
+              <w:rPr>
+                <w:rFonts w:ascii="Arial" w:hAnsi="Arial"/>
+                <w:b w:val="0"/>
+                <w:sz w:val="19"/>
+              </w:rPr>
+              <w:t>A1. Havendo ponto de encontro, ele entra na rota como parada intermediária.</w:t>
+            </w:r>
+          </w:p>
+        </w:tc>
+      </w:tr>
+      <w:tr>
+        <w:trPr>
+          <w:cantSplit/>
+        </w:trPr>
+        <w:tc>
+          <w:tcPr>
+            <w:tcW w:type="dxa" w:w="2948"/>
+            <w:shd w:val="clear" w:color="auto" w:fill="D9E8F5"/>
+          </w:tcPr>
+          <w:p>
+            <w:pPr>
+              <w:keepNext/>
+              <w:spacing w:after="20" w:before="20" w:line="240" w:lineRule="auto"/>
+            </w:pPr>
+            <w:r/>
+            <w:r>
+              <w:rPr>
+                <w:rFonts w:ascii="Arial" w:hAnsi="Arial"/>
+                <w:b/>
+                <w:sz w:val="19"/>
+              </w:rPr>
+              <w:t>Fluxos de Exceção</w:t>
+            </w:r>
+          </w:p>
+        </w:tc>
+        <w:tc>
+          <w:tcPr>
+            <w:tcW w:type="dxa" w:w="6123"/>
+          </w:tcPr>
+          <w:p>
+            <w:pPr>
+              <w:pStyle w:val="ListBullet"/>
+              <w:keepNext/>
+              <w:spacing w:after="20" w:before="20" w:line="240" w:lineRule="auto"/>
+            </w:pPr>
+            <w:r/>
+            <w:r>
+              <w:rPr>
+                <w:rFonts w:ascii="Arial" w:hAnsi="Arial"/>
+                <w:b w:val="0"/>
+                <w:sz w:val="19"/>
+              </w:rPr>
+              <w:t>E1. Local não encontrado: o sistema pede a correção do endereço.</w:t>
+            </w:r>
+          </w:p>
+          <w:p>
+            <w:pPr>
+              <w:pStyle w:val="ListBullet"/>
+              <w:keepNext/>
+              <w:spacing w:after="20" w:before="20" w:line="240" w:lineRule="auto"/>
+            </w:pPr>
+            <w:r>
+              <w:rPr>
+                <w:rFonts w:ascii="Arial" w:hAnsi="Arial"/>
+                <w:b w:val="0"/>
+                <w:sz w:val="19"/>
+              </w:rPr>
+              <w:t>E2. Google Maps indisponível: o sistema mantém o formulário, mostra os dados em texto e permite nova tentativa.</w:t>
+            </w:r>
+          </w:p>
+        </w:tc>
+      </w:tr>
+      <w:tr>
+        <w:trPr>
+          <w:cantSplit/>
+        </w:trPr>
+        <w:tc>
+          <w:tcPr>
+            <w:tcW w:type="dxa" w:w="2948"/>
+            <w:shd w:val="clear" w:color="auto" w:fill="D9E8F5"/>
+          </w:tcPr>
+          <w:p>
+            <w:pPr>
+              <w:keepNext/>
+              <w:spacing w:after="20" w:before="20" w:line="240" w:lineRule="auto"/>
+            </w:pPr>
+            <w:r/>
+            <w:r>
+              <w:rPr>
+                <w:rFonts w:ascii="Arial" w:hAnsi="Arial"/>
+                <w:b/>
+                <w:sz w:val="19"/>
+              </w:rPr>
+              <w:t>Pós-condições</w:t>
+            </w:r>
+          </w:p>
+        </w:tc>
+        <w:tc>
+          <w:tcPr>
+            <w:tcW w:type="dxa" w:w="6123"/>
+          </w:tcPr>
+          <w:p>
+            <w:pPr>
+              <w:pStyle w:val="ListBullet"/>
+              <w:keepNext/>
+              <w:spacing w:after="20" w:before="20" w:line="240" w:lineRule="auto"/>
+            </w:pPr>
+            <w:r/>
+            <w:r>
+              <w:rPr>
+                <w:rFonts w:ascii="Arial" w:hAnsi="Arial"/>
+                <w:b w:val="0"/>
+                <w:sz w:val="19"/>
+              </w:rPr>
+              <w:t>Rota, distância e duração ficam associadas à carona que está sendo publicada.</w:t>
+            </w:r>
+          </w:p>
+        </w:tc>
+      </w:tr>
+      <w:tr>
+        <w:trPr>
+          <w:cantSplit/>
+        </w:trPr>
+        <w:tc>
+          <w:tcPr>
+            <w:tcW w:type="dxa" w:w="2948"/>
+            <w:shd w:val="clear" w:color="auto" w:fill="D9E8F5"/>
+          </w:tcPr>
+          <w:p>
+            <w:pPr>
+              <w:keepNext/>
+              <w:spacing w:after="20" w:before="20" w:line="240" w:lineRule="auto"/>
+            </w:pPr>
+            <w:r/>
+            <w:r>
+              <w:rPr>
+                <w:rFonts w:ascii="Arial" w:hAnsi="Arial"/>
+                <w:b/>
+                <w:sz w:val="19"/>
+              </w:rPr>
+              <w:t>Critérios de Aceite</w:t>
+            </w:r>
+          </w:p>
+        </w:tc>
+        <w:tc>
+          <w:tcPr>
+            <w:tcW w:type="dxa" w:w="6123"/>
+          </w:tcPr>
+          <w:p>
+            <w:pPr>
+              <w:pStyle w:val="ListBullet"/>
+              <w:keepNext/>
+              <w:spacing w:after="20" w:before="20" w:line="240" w:lineRule="auto"/>
+            </w:pPr>
+            <w:r/>
+            <w:r>
+              <w:rPr>
+                <w:rFonts w:ascii="Arial" w:hAnsi="Arial"/>
+                <w:b w:val="0"/>
+                <w:sz w:val="19"/>
+              </w:rPr>
+              <w:t>É executado em toda publicação de carona.</w:t>
+            </w:r>
+          </w:p>
+          <w:p>
+            <w:pPr>
+              <w:pStyle w:val="ListBullet"/>
+              <w:keepNext/>
+              <w:spacing w:after="20" w:before="20" w:line="240" w:lineRule="auto"/>
+            </w:pPr>
+            <w:r>
+              <w:rPr>
+                <w:rFonts w:ascii="Arial" w:hAnsi="Arial"/>
+                <w:b w:val="0"/>
+                <w:sz w:val="19"/>
+              </w:rPr>
+              <w:t>Não é iniciado diretamente pelo estudante.</w:t>
+            </w:r>
+          </w:p>
+          <w:p>
+            <w:pPr>
+              <w:pStyle w:val="ListBullet"/>
+              <w:keepNext/>
+              <w:spacing w:after="20" w:before="20" w:line="240" w:lineRule="auto"/>
+            </w:pPr>
+            <w:r>
+              <w:rPr>
+                <w:rFonts w:ascii="Arial" w:hAnsi="Arial"/>
+                <w:b w:val="0"/>
+                <w:sz w:val="19"/>
+              </w:rPr>
+              <w:t>Uma falha do Google Maps não apaga os dados já preenchidos.</w:t>
+            </w:r>
+          </w:p>
+        </w:tc>
+      </w:tr>
+      <w:tr>
+        <w:trPr>
+          <w:cantSplit/>
+        </w:trPr>
+        <w:tc>
+          <w:tcPr>
+            <w:tcW w:type="dxa" w:w="2948"/>
+            <w:shd w:val="clear" w:color="auto" w:fill="D9E8F5"/>
+          </w:tcPr>
+          <w:p>
+            <w:pPr>
+              <w:spacing w:after="20" w:before="20" w:line="240" w:lineRule="auto"/>
+            </w:pPr>
+            <w:r/>
+            <w:r>
+              <w:rPr>
+                <w:rFonts w:ascii="Arial" w:hAnsi="Arial"/>
+                <w:b/>
+                <w:sz w:val="19"/>
+              </w:rPr>
+              <w:t>Requisitos e regras relacionados</w:t>
+            </w:r>
+          </w:p>
+        </w:tc>
+        <w:tc>
+          <w:tcPr>
+            <w:tcW w:type="dxa" w:w="6123"/>
+          </w:tcPr>
+          <w:p>
+            <w:pPr>
+              <w:spacing w:after="20" w:before="20" w:line="240" w:lineRule="auto"/>
+            </w:pPr>
+            <w:r/>
+            <w:r>
+              <w:rPr>
+                <w:rFonts w:ascii="Arial" w:hAnsi="Arial"/>
+                <w:b w:val="0"/>
+                <w:sz w:val="19"/>
+              </w:rPr>
+              <w:t>RF09-RF10, RF12; RN17-RN18</w:t>
+            </w:r>
+          </w:p>
+        </w:tc>
+      </w:tr>
+    </w:tbl>
+    <w:p>
+      <w:pPr>
+        <w:pStyle w:val="Heading3"/>
+      </w:pPr>
+      <w:r>
+        <w:t>UC14 - Recalcular rota</w:t>
+      </w:r>
+    </w:p>
+    <w:tbl>
+      <w:tblPr>
+        <w:tblW w:type="auto" w:w="0"/>
+        <w:jc w:val="center"/>
+        <w:tblLayout w:type="fixed"/>
+        <w:tblLook w:firstColumn="1" w:firstRow="1" w:lastColumn="0" w:lastRow="0" w:noHBand="0" w:noVBand="1" w:val="04A0"/>
+        <w:tblBorders>
+          <w:top w:val="single" w:sz="8" w:color="000000"/>
+          <w:left w:val="single" w:sz="8" w:color="000000"/>
+          <w:bottom w:val="single" w:sz="8" w:color="000000"/>
+          <w:right w:val="single" w:sz="8" w:color="000000"/>
+          <w:insideH w:val="single" w:sz="8" w:color="000000"/>
+          <w:insideV w:val="single" w:sz="8" w:color="000000"/>
+        </w:tblBorders>
+      </w:tblPr>
+      <w:tblGrid>
+        <w:gridCol w:w="2948"/>
+        <w:gridCol w:w="6123"/>
+      </w:tblGrid>
+      <w:tr>
+        <w:trPr>
+          <w:cantSplit/>
+        </w:trPr>
+        <w:tc>
+          <w:tcPr>
+            <w:tcW w:type="dxa" w:w="2948"/>
+            <w:shd w:val="clear" w:color="auto" w:fill="D9E8F5"/>
+          </w:tcPr>
+          <w:p>
+            <w:pPr>
+              <w:keepNext/>
+              <w:spacing w:after="20" w:before="20" w:line="240" w:lineRule="auto"/>
+            </w:pPr>
+            <w:r/>
+            <w:r>
+              <w:rPr>
+                <w:rFonts w:ascii="Arial" w:hAnsi="Arial"/>
+                <w:b/>
+                <w:sz w:val="19"/>
+              </w:rPr>
+              <w:t>Caso de Uso</w:t>
+            </w:r>
+          </w:p>
+        </w:tc>
+        <w:tc>
+          <w:tcPr>
+            <w:tcW w:type="dxa" w:w="6123"/>
+            <w:shd w:val="clear" w:color="auto" w:fill="D9E8F5"/>
+          </w:tcPr>
+          <w:p>
+            <w:pPr>
+              <w:keepNext/>
+              <w:spacing w:after="20" w:before="20" w:line="240" w:lineRule="auto"/>
+            </w:pPr>
+            <w:r/>
+            <w:r>
+              <w:rPr>
+                <w:rFonts w:ascii="Arial" w:hAnsi="Arial"/>
+                <w:b/>
+                <w:sz w:val="19"/>
+              </w:rPr>
+              <w:t>UC14 - Recalcular rota</w:t>
+            </w:r>
+          </w:p>
+        </w:tc>
+      </w:tr>
+      <w:tr>
+        <w:trPr>
+          <w:cantSplit/>
+        </w:trPr>
+        <w:tc>
+          <w:tcPr>
+            <w:tcW w:type="dxa" w:w="2948"/>
+            <w:shd w:val="clear" w:color="auto" w:fill="D9E8F5"/>
+          </w:tcPr>
+          <w:p>
+            <w:pPr>
+              <w:keepNext/>
+              <w:spacing w:after="20" w:before="20" w:line="240" w:lineRule="auto"/>
+            </w:pPr>
+            <w:r/>
+            <w:r>
+              <w:rPr>
+                <w:rFonts w:ascii="Arial" w:hAnsi="Arial"/>
+                <w:b/>
+                <w:sz w:val="19"/>
+              </w:rPr>
+              <w:t>Ator(es)</w:t>
+            </w:r>
+          </w:p>
+        </w:tc>
+        <w:tc>
+          <w:tcPr>
+            <w:tcW w:type="dxa" w:w="6123"/>
+          </w:tcPr>
+          <w:p>
+            <w:pPr>
+              <w:keepNext/>
+              <w:spacing w:after="20" w:before="20" w:line="240" w:lineRule="auto"/>
+            </w:pPr>
+            <w:r/>
+            <w:r>
+              <w:rPr>
+                <w:rFonts w:ascii="Arial" w:hAnsi="Arial"/>
+                <w:b w:val="0"/>
+                <w:sz w:val="19"/>
+              </w:rPr>
+              <w:t>Google Maps</w:t>
+            </w:r>
+          </w:p>
+        </w:tc>
+      </w:tr>
+      <w:tr>
+        <w:trPr>
+          <w:cantSplit/>
+        </w:trPr>
+        <w:tc>
+          <w:tcPr>
+            <w:tcW w:type="dxa" w:w="2948"/>
+            <w:shd w:val="clear" w:color="auto" w:fill="D9E8F5"/>
+          </w:tcPr>
+          <w:p>
+            <w:pPr>
+              <w:keepNext/>
+              <w:spacing w:after="20" w:before="20" w:line="240" w:lineRule="auto"/>
+            </w:pPr>
+            <w:r/>
+            <w:r>
+              <w:rPr>
+                <w:rFonts w:ascii="Arial" w:hAnsi="Arial"/>
+                <w:b/>
+                <w:sz w:val="19"/>
+              </w:rPr>
+              <w:t>História de usuário</w:t>
+            </w:r>
+          </w:p>
+        </w:tc>
+        <w:tc>
+          <w:tcPr>
+            <w:tcW w:type="dxa" w:w="6123"/>
+          </w:tcPr>
+          <w:p>
+            <w:pPr>
+              <w:keepNext/>
+              <w:spacing w:after="20" w:before="20" w:line="240" w:lineRule="auto"/>
+            </w:pPr>
+            <w:r/>
+            <w:r>
+              <w:rPr>
+                <w:rFonts w:ascii="Arial" w:hAnsi="Arial"/>
+                <w:b w:val="0"/>
+                <w:sz w:val="19"/>
+              </w:rPr>
+              <w:t>Como passageiro confirmado, quero que a rota seja atualizada quando o motorista muda um local, para saber onde e quando encontrá-lo.</w:t>
+            </w:r>
+          </w:p>
+        </w:tc>
+      </w:tr>
+      <w:tr>
+        <w:trPr>
+          <w:cantSplit/>
+        </w:trPr>
+        <w:tc>
+          <w:tcPr>
+            <w:tcW w:type="dxa" w:w="2948"/>
+            <w:shd w:val="clear" w:color="auto" w:fill="D9E8F5"/>
+          </w:tcPr>
+          <w:p>
+            <w:pPr>
+              <w:keepNext/>
+              <w:spacing w:after="20" w:before="20" w:line="240" w:lineRule="auto"/>
+            </w:pPr>
+            <w:r/>
+            <w:r>
+              <w:rPr>
+                <w:rFonts w:ascii="Arial" w:hAnsi="Arial"/>
+                <w:b/>
+                <w:sz w:val="19"/>
+              </w:rPr>
+              <w:t>Pré-requisitos</w:t>
+            </w:r>
+          </w:p>
+        </w:tc>
+        <w:tc>
+          <w:tcPr>
+            <w:tcW w:type="dxa" w:w="6123"/>
+          </w:tcPr>
+          <w:p>
+            <w:pPr>
+              <w:pStyle w:val="ListBullet"/>
+              <w:keepNext/>
+              <w:spacing w:after="20" w:before="20" w:line="240" w:lineRule="auto"/>
+            </w:pPr>
+            <w:r/>
+            <w:r>
+              <w:rPr>
+                <w:rFonts w:ascii="Arial" w:hAnsi="Arial"/>
+                <w:b w:val="0"/>
+                <w:sz w:val="19"/>
+              </w:rPr>
+              <w:t>Em UC06 Atualizar carona, o motorista alterou origem, destino ou ponto de encontro (condição do ponto de extensão).</w:t>
+            </w:r>
+          </w:p>
+          <w:p>
+            <w:pPr>
+              <w:pStyle w:val="ListBullet"/>
+              <w:keepNext/>
+              <w:spacing w:after="20" w:before="20" w:line="240" w:lineRule="auto"/>
+            </w:pPr>
+            <w:r/>
+            <w:r>
+              <w:rPr>
+                <w:rFonts w:ascii="Arial" w:hAnsi="Arial"/>
+                <w:b w:val="0"/>
+                <w:sz w:val="19"/>
+              </w:rPr>
+              <w:t>A carona ainda não foi iniciada.</w:t>
+            </w:r>
+          </w:p>
+        </w:tc>
+      </w:tr>
+      <w:tr>
+        <w:trPr>
+          <w:cantSplit/>
+        </w:trPr>
+        <w:tc>
+          <w:tcPr>
+            <w:tcW w:type="dxa" w:w="2948"/>
+            <w:shd w:val="clear" w:color="auto" w:fill="D9E8F5"/>
+          </w:tcPr>
+          <w:p>
+            <w:pPr>
+              <w:keepNext/>
+              <w:spacing w:after="20" w:before="20" w:line="240" w:lineRule="auto"/>
+            </w:pPr>
+            <w:r/>
+            <w:r>
+              <w:rPr>
+                <w:rFonts w:ascii="Arial" w:hAnsi="Arial"/>
+                <w:b/>
+                <w:sz w:val="19"/>
+              </w:rPr>
+              <w:t>Fluxo Principal</w:t>
+            </w:r>
+          </w:p>
+        </w:tc>
+        <w:tc>
+          <w:tcPr>
+            <w:tcW w:type="dxa" w:w="6123"/>
+          </w:tcPr>
+          <w:p>
+            <w:pPr>
+              <w:keepNext/>
+              <w:spacing w:after="20" w:before="20" w:line="240" w:lineRule="auto"/>
+            </w:pPr>
+            <w:r/>
+            <w:r>
+              <w:rPr>
+                <w:rFonts w:ascii="Arial" w:hAnsi="Arial"/>
+                <w:b w:val="0"/>
+                <w:sz w:val="19"/>
+              </w:rPr>
+              <w:t>1. O sistema envia os locais alterados ao Google Maps.</w:t>
+            </w:r>
+          </w:p>
+          <w:p>
+            <w:pPr>
+              <w:keepNext/>
+              <w:spacing w:after="20" w:before="20" w:line="240" w:lineRule="auto"/>
+            </w:pPr>
+            <w:r>
+              <w:rPr>
+                <w:rFonts w:ascii="Arial" w:hAnsi="Arial"/>
+                <w:b w:val="0"/>
+                <w:sz w:val="19"/>
+              </w:rPr>
+              <w:t>2. O Google Maps devolve a nova rota, a distância e a duração.</w:t>
+            </w:r>
+          </w:p>
+          <w:p>
+            <w:pPr>
+              <w:keepNext/>
+              <w:spacing w:after="20" w:before="20" w:line="240" w:lineRule="auto"/>
+            </w:pPr>
+            <w:r>
+              <w:rPr>
+                <w:rFonts w:ascii="Arial" w:hAnsi="Arial"/>
+                <w:b w:val="0"/>
+                <w:sz w:val="19"/>
+              </w:rPr>
+              <w:t>3. O sistema mostra a rota anterior e a nova para o motorista conferir.</w:t>
+            </w:r>
+          </w:p>
+          <w:p>
+            <w:pPr>
+              <w:keepNext/>
+              <w:spacing w:after="20" w:before="20" w:line="240" w:lineRule="auto"/>
+            </w:pPr>
+            <w:r>
+              <w:rPr>
+                <w:rFonts w:ascii="Arial" w:hAnsi="Arial"/>
+                <w:b w:val="0"/>
+                <w:sz w:val="19"/>
+              </w:rPr>
+              <w:t>4. O fluxo volta para UC06, onde o motorista confirma a alteração.</w:t>
+            </w:r>
+          </w:p>
+        </w:tc>
+      </w:tr>
+      <w:tr>
+        <w:trPr>
+          <w:cantSplit/>
+        </w:trPr>
+        <w:tc>
+          <w:tcPr>
+            <w:tcW w:type="dxa" w:w="2948"/>
+            <w:shd w:val="clear" w:color="auto" w:fill="D9E8F5"/>
+          </w:tcPr>
+          <w:p>
+            <w:pPr>
+              <w:keepNext/>
+              <w:spacing w:after="20" w:before="20" w:line="240" w:lineRule="auto"/>
+            </w:pPr>
+            <w:r/>
+            <w:r>
+              <w:rPr>
+                <w:rFonts w:ascii="Arial" w:hAnsi="Arial"/>
+                <w:b/>
+                <w:sz w:val="19"/>
+              </w:rPr>
+              <w:t>Fluxos Alternativos</w:t>
+            </w:r>
+          </w:p>
+        </w:tc>
+        <w:tc>
+          <w:tcPr>
+            <w:tcW w:type="dxa" w:w="6123"/>
+          </w:tcPr>
+          <w:p>
+            <w:pPr>
+              <w:pStyle w:val="ListBullet"/>
+              <w:keepNext/>
+              <w:spacing w:after="20" w:before="20" w:line="240" w:lineRule="auto"/>
+            </w:pPr>
+            <w:r/>
+            <w:r>
+              <w:rPr>
+                <w:rFonts w:ascii="Arial" w:hAnsi="Arial"/>
+                <w:b w:val="0"/>
+                <w:sz w:val="19"/>
+              </w:rPr>
+              <w:t>A1. O motorista desfaz a mudança de local; a rota anterior é mantida.</w:t>
+            </w:r>
+          </w:p>
+        </w:tc>
+      </w:tr>
+      <w:tr>
+        <w:trPr>
+          <w:cantSplit/>
+        </w:trPr>
+        <w:tc>
+          <w:tcPr>
+            <w:tcW w:type="dxa" w:w="2948"/>
+            <w:shd w:val="clear" w:color="auto" w:fill="D9E8F5"/>
+          </w:tcPr>
+          <w:p>
+            <w:pPr>
+              <w:keepNext/>
+              <w:spacing w:after="20" w:before="20" w:line="240" w:lineRule="auto"/>
+            </w:pPr>
+            <w:r/>
+            <w:r>
+              <w:rPr>
+                <w:rFonts w:ascii="Arial" w:hAnsi="Arial"/>
+                <w:b/>
+                <w:sz w:val="19"/>
+              </w:rPr>
+              <w:t>Fluxos de Exceção</w:t>
+            </w:r>
+          </w:p>
+        </w:tc>
+        <w:tc>
+          <w:tcPr>
+            <w:tcW w:type="dxa" w:w="6123"/>
+          </w:tcPr>
+          <w:p>
+            <w:pPr>
+              <w:pStyle w:val="ListBullet"/>
+              <w:keepNext/>
+              <w:spacing w:after="20" w:before="20" w:line="240" w:lineRule="auto"/>
+            </w:pPr>
+            <w:r/>
+            <w:r>
+              <w:rPr>
+                <w:rFonts w:ascii="Arial" w:hAnsi="Arial"/>
+                <w:b w:val="0"/>
+                <w:sz w:val="19"/>
+              </w:rPr>
+              <w:t>E1. Google Maps indisponível: a mudança de local não é confirmada e os demais dados continuam preservados.</w:t>
+            </w:r>
+          </w:p>
+        </w:tc>
+      </w:tr>
+      <w:tr>
+        <w:trPr>
+          <w:cantSplit/>
+        </w:trPr>
+        <w:tc>
+          <w:tcPr>
+            <w:tcW w:type="dxa" w:w="2948"/>
+            <w:shd w:val="clear" w:color="auto" w:fill="D9E8F5"/>
+          </w:tcPr>
+          <w:p>
+            <w:pPr>
+              <w:keepNext/>
+              <w:spacing w:after="20" w:before="20" w:line="240" w:lineRule="auto"/>
+            </w:pPr>
+            <w:r/>
+            <w:r>
+              <w:rPr>
+                <w:rFonts w:ascii="Arial" w:hAnsi="Arial"/>
+                <w:b/>
+                <w:sz w:val="19"/>
+              </w:rPr>
+              <w:t>Pós-condições</w:t>
+            </w:r>
+          </w:p>
+        </w:tc>
+        <w:tc>
+          <w:tcPr>
+            <w:tcW w:type="dxa" w:w="6123"/>
+          </w:tcPr>
+          <w:p>
+            <w:pPr>
+              <w:pStyle w:val="ListBullet"/>
+              <w:keepNext/>
+              <w:spacing w:after="20" w:before="20" w:line="240" w:lineRule="auto"/>
+            </w:pPr>
+            <w:r/>
+            <w:r>
+              <w:rPr>
+                <w:rFonts w:ascii="Arial" w:hAnsi="Arial"/>
+                <w:b w:val="0"/>
+                <w:sz w:val="19"/>
+              </w:rPr>
+              <w:t>A carona passa a ter a nova rota e os passageiros confirmados são notificados.</w:t>
+            </w:r>
+          </w:p>
+        </w:tc>
+      </w:tr>
+      <w:tr>
+        <w:trPr>
+          <w:cantSplit/>
+        </w:trPr>
+        <w:tc>
+          <w:tcPr>
+            <w:tcW w:type="dxa" w:w="2948"/>
+            <w:shd w:val="clear" w:color="auto" w:fill="D9E8F5"/>
+          </w:tcPr>
+          <w:p>
+            <w:pPr>
+              <w:keepNext/>
+              <w:spacing w:after="20" w:before="20" w:line="240" w:lineRule="auto"/>
+            </w:pPr>
+            <w:r/>
+            <w:r>
+              <w:rPr>
+                <w:rFonts w:ascii="Arial" w:hAnsi="Arial"/>
+                <w:b/>
+                <w:sz w:val="19"/>
+              </w:rPr>
+              <w:t>Critérios de Aceite</w:t>
+            </w:r>
+          </w:p>
+        </w:tc>
+        <w:tc>
+          <w:tcPr>
+            <w:tcW w:type="dxa" w:w="6123"/>
+          </w:tcPr>
+          <w:p>
+            <w:pPr>
+              <w:pStyle w:val="ListBullet"/>
+              <w:keepNext/>
+              <w:spacing w:after="20" w:before="20" w:line="240" w:lineRule="auto"/>
+            </w:pPr>
+            <w:r/>
+            <w:r>
+              <w:rPr>
+                <w:rFonts w:ascii="Arial" w:hAnsi="Arial"/>
+                <w:b w:val="0"/>
+                <w:sz w:val="19"/>
+              </w:rPr>
+              <w:t>Só ocorre quando um local muda.</w:t>
+            </w:r>
+          </w:p>
+          <w:p>
+            <w:pPr>
+              <w:pStyle w:val="ListBullet"/>
+              <w:keepNext/>
+              <w:spacing w:after="20" w:before="20" w:line="240" w:lineRule="auto"/>
+            </w:pPr>
+            <w:r>
+              <w:rPr>
+                <w:rFonts w:ascii="Arial" w:hAnsi="Arial"/>
+                <w:b w:val="0"/>
+                <w:sz w:val="19"/>
+              </w:rPr>
+              <w:t>Mudanças apenas de horário, vagas ou observações não consultam o Google Maps.</w:t>
+            </w:r>
+          </w:p>
+        </w:tc>
+      </w:tr>
+      <w:tr>
+        <w:trPr>
+          <w:cantSplit/>
+        </w:trPr>
+        <w:tc>
+          <w:tcPr>
+            <w:tcW w:type="dxa" w:w="2948"/>
+            <w:shd w:val="clear" w:color="auto" w:fill="D9E8F5"/>
+          </w:tcPr>
+          <w:p>
+            <w:pPr>
+              <w:spacing w:after="20" w:before="20" w:line="240" w:lineRule="auto"/>
+            </w:pPr>
+            <w:r/>
+            <w:r>
+              <w:rPr>
+                <w:rFonts w:ascii="Arial" w:hAnsi="Arial"/>
+                <w:b/>
+                <w:sz w:val="19"/>
+              </w:rPr>
+              <w:t>Requisitos e regras relacionados</w:t>
+            </w:r>
+          </w:p>
+        </w:tc>
+        <w:tc>
+          <w:tcPr>
+            <w:tcW w:type="dxa" w:w="6123"/>
+          </w:tcPr>
+          <w:p>
+            <w:pPr>
+              <w:spacing w:after="20" w:before="20" w:line="240" w:lineRule="auto"/>
+            </w:pPr>
+            <w:r/>
+            <w:r>
+              <w:rPr>
+                <w:rFonts w:ascii="Arial" w:hAnsi="Arial"/>
+                <w:b w:val="0"/>
+                <w:sz w:val="19"/>
+              </w:rPr>
+              <w:t>RF11-RF12, RF21; RN14, RN17</w:t>
+            </w:r>
+          </w:p>
+        </w:tc>
+      </w:tr>
+    </w:tbl>
+    <w:p>
+      <w:pPr>
+        <w:pStyle w:val="Heading3"/>
+      </w:pPr>
+      <w:r>
+        <w:t>UC15 - Remover avaliação</w:t>
+      </w:r>
+    </w:p>
+    <w:tbl>
+      <w:tblPr>
+        <w:tblW w:type="auto" w:w="0"/>
+        <w:jc w:val="center"/>
+        <w:tblLayout w:type="fixed"/>
+        <w:tblLook w:firstColumn="1" w:firstRow="1" w:lastColumn="0" w:lastRow="0" w:noHBand="0" w:noVBand="1" w:val="04A0"/>
+        <w:tblBorders>
+          <w:top w:val="single" w:sz="8" w:color="000000"/>
+          <w:left w:val="single" w:sz="8" w:color="000000"/>
+          <w:bottom w:val="single" w:sz="8" w:color="000000"/>
+          <w:right w:val="single" w:sz="8" w:color="000000"/>
+          <w:insideH w:val="single" w:sz="8" w:color="000000"/>
+          <w:insideV w:val="single" w:sz="8" w:color="000000"/>
+        </w:tblBorders>
+      </w:tblPr>
+      <w:tblGrid>
+        <w:gridCol w:w="2948"/>
+        <w:gridCol w:w="6123"/>
+      </w:tblGrid>
+      <w:tr>
+        <w:trPr>
+          <w:cantSplit/>
+        </w:trPr>
+        <w:tc>
+          <w:tcPr>
+            <w:tcW w:type="dxa" w:w="2948"/>
+            <w:shd w:val="clear" w:color="auto" w:fill="D9E8F5"/>
+          </w:tcPr>
+          <w:p>
+            <w:pPr>
+              <w:keepNext/>
+              <w:spacing w:after="20" w:before="20" w:line="240" w:lineRule="auto"/>
+            </w:pPr>
+            <w:r/>
+            <w:r>
+              <w:rPr>
+                <w:rFonts w:ascii="Arial" w:hAnsi="Arial"/>
+                <w:b/>
+                <w:sz w:val="19"/>
+              </w:rPr>
+              <w:t>Caso de Uso</w:t>
+            </w:r>
+          </w:p>
+        </w:tc>
+        <w:tc>
+          <w:tcPr>
+            <w:tcW w:type="dxa" w:w="6123"/>
+            <w:shd w:val="clear" w:color="auto" w:fill="D9E8F5"/>
+          </w:tcPr>
+          <w:p>
+            <w:pPr>
+              <w:keepNext/>
+              <w:spacing w:after="20" w:before="20" w:line="240" w:lineRule="auto"/>
+            </w:pPr>
+            <w:r/>
+            <w:r>
+              <w:rPr>
+                <w:rFonts w:ascii="Arial" w:hAnsi="Arial"/>
+                <w:b/>
+                <w:sz w:val="19"/>
+              </w:rPr>
+              <w:t>UC15 - Remover avaliação</w:t>
+            </w:r>
+          </w:p>
+        </w:tc>
+      </w:tr>
+      <w:tr>
+        <w:trPr>
+          <w:cantSplit/>
+        </w:trPr>
+        <w:tc>
+          <w:tcPr>
+            <w:tcW w:type="dxa" w:w="2948"/>
+            <w:shd w:val="clear" w:color="auto" w:fill="D9E8F5"/>
+          </w:tcPr>
+          <w:p>
+            <w:pPr>
+              <w:keepNext/>
+              <w:spacing w:after="20" w:before="20" w:line="240" w:lineRule="auto"/>
+            </w:pPr>
+            <w:r/>
+            <w:r>
+              <w:rPr>
+                <w:rFonts w:ascii="Arial" w:hAnsi="Arial"/>
+                <w:b/>
+                <w:sz w:val="19"/>
+              </w:rPr>
+              <w:t>Ator(es)</w:t>
+            </w:r>
+          </w:p>
+        </w:tc>
+        <w:tc>
+          <w:tcPr>
+            <w:tcW w:type="dxa" w:w="6123"/>
+          </w:tcPr>
+          <w:p>
+            <w:pPr>
+              <w:keepNext/>
+              <w:spacing w:after="20" w:before="20" w:line="240" w:lineRule="auto"/>
+            </w:pPr>
+            <w:r/>
+            <w:r>
+              <w:rPr>
+                <w:rFonts w:ascii="Arial" w:hAnsi="Arial"/>
+                <w:b w:val="0"/>
+                <w:sz w:val="19"/>
+              </w:rPr>
+              <w:t>Administrador (a partir de UC10)</w:t>
+            </w:r>
+          </w:p>
+        </w:tc>
+      </w:tr>
+      <w:tr>
+        <w:trPr>
+          <w:cantSplit/>
+        </w:trPr>
+        <w:tc>
+          <w:tcPr>
+            <w:tcW w:type="dxa" w:w="2948"/>
+            <w:shd w:val="clear" w:color="auto" w:fill="D9E8F5"/>
+          </w:tcPr>
+          <w:p>
+            <w:pPr>
+              <w:keepNext/>
+              <w:spacing w:after="20" w:before="20" w:line="240" w:lineRule="auto"/>
+            </w:pPr>
+            <w:r/>
+            <w:r>
+              <w:rPr>
+                <w:rFonts w:ascii="Arial" w:hAnsi="Arial"/>
+                <w:b/>
+                <w:sz w:val="19"/>
+              </w:rPr>
+              <w:t>História de usuário</w:t>
+            </w:r>
+          </w:p>
+        </w:tc>
+        <w:tc>
+          <w:tcPr>
+            <w:tcW w:type="dxa" w:w="6123"/>
+          </w:tcPr>
+          <w:p>
+            <w:pPr>
+              <w:keepNext/>
+              <w:spacing w:after="20" w:before="20" w:line="240" w:lineRule="auto"/>
+            </w:pPr>
+            <w:r/>
+            <w:r>
+              <w:rPr>
+                <w:rFonts w:ascii="Arial" w:hAnsi="Arial"/>
+                <w:b w:val="0"/>
+                <w:sz w:val="19"/>
+              </w:rPr>
+              <w:t>Como administrador, quero remover uma avaliação considerada indevida, para que ela não distorça a reputação de quem foi avaliado.</w:t>
+            </w:r>
+          </w:p>
+        </w:tc>
+      </w:tr>
+      <w:tr>
+        <w:trPr>
+          <w:cantSplit/>
+        </w:trPr>
+        <w:tc>
+          <w:tcPr>
+            <w:tcW w:type="dxa" w:w="2948"/>
+            <w:shd w:val="clear" w:color="auto" w:fill="D9E8F5"/>
+          </w:tcPr>
+          <w:p>
+            <w:pPr>
+              <w:keepNext/>
+              <w:spacing w:after="20" w:before="20" w:line="240" w:lineRule="auto"/>
+            </w:pPr>
+            <w:r/>
+            <w:r>
+              <w:rPr>
+                <w:rFonts w:ascii="Arial" w:hAnsi="Arial"/>
+                <w:b/>
+                <w:sz w:val="19"/>
+              </w:rPr>
+              <w:t>Pré-requisitos</w:t>
+            </w:r>
+          </w:p>
+        </w:tc>
+        <w:tc>
+          <w:tcPr>
+            <w:tcW w:type="dxa" w:w="6123"/>
+          </w:tcPr>
+          <w:p>
+            <w:pPr>
+              <w:pStyle w:val="ListBullet"/>
+              <w:keepNext/>
+              <w:spacing w:after="20" w:before="20" w:line="240" w:lineRule="auto"/>
+            </w:pPr>
+            <w:r/>
+            <w:r>
+              <w:rPr>
+                <w:rFonts w:ascii="Arial" w:hAnsi="Arial"/>
+                <w:b w:val="0"/>
+                <w:sz w:val="19"/>
+              </w:rPr>
+              <w:t>Em UC10 Julgar denúncia, uma denúncia sobre uma avaliação foi julgada procedente (condição do ponto de extensão).</w:t>
+            </w:r>
+          </w:p>
+        </w:tc>
+      </w:tr>
+      <w:tr>
+        <w:trPr>
+          <w:cantSplit/>
+        </w:trPr>
+        <w:tc>
+          <w:tcPr>
+            <w:tcW w:type="dxa" w:w="2948"/>
+            <w:shd w:val="clear" w:color="auto" w:fill="D9E8F5"/>
+          </w:tcPr>
+          <w:p>
+            <w:pPr>
+              <w:keepNext/>
+              <w:spacing w:after="20" w:before="20" w:line="240" w:lineRule="auto"/>
+            </w:pPr>
+            <w:r/>
+            <w:r>
+              <w:rPr>
+                <w:rFonts w:ascii="Arial" w:hAnsi="Arial"/>
+                <w:b/>
+                <w:sz w:val="19"/>
+              </w:rPr>
+              <w:t>Fluxo Principal</w:t>
+            </w:r>
+          </w:p>
+        </w:tc>
+        <w:tc>
+          <w:tcPr>
+            <w:tcW w:type="dxa" w:w="6123"/>
+          </w:tcPr>
+          <w:p>
+            <w:pPr>
+              <w:keepNext/>
+              <w:spacing w:after="20" w:before="20" w:line="240" w:lineRule="auto"/>
+            </w:pPr>
+            <w:r/>
+            <w:r>
+              <w:rPr>
+                <w:rFonts w:ascii="Arial" w:hAnsi="Arial"/>
+                <w:b w:val="0"/>
+                <w:sz w:val="19"/>
+              </w:rPr>
+              <w:t>1. O administrador escolhe remover a avaliação denunciada.</w:t>
+            </w:r>
+          </w:p>
+          <w:p>
+            <w:pPr>
+              <w:keepNext/>
+              <w:spacing w:after="20" w:before="20" w:line="240" w:lineRule="auto"/>
+            </w:pPr>
+            <w:r>
+              <w:rPr>
+                <w:rFonts w:ascii="Arial" w:hAnsi="Arial"/>
+                <w:b w:val="0"/>
+                <w:sz w:val="19"/>
+              </w:rPr>
+              <w:t>2. O sistema marca a avaliação como removida, sem apagá-la do banco.</w:t>
+            </w:r>
+          </w:p>
+          <w:p>
+            <w:pPr>
+              <w:keepNext/>
+              <w:spacing w:after="20" w:before="20" w:line="240" w:lineRule="auto"/>
+            </w:pPr>
+            <w:r>
+              <w:rPr>
+                <w:rFonts w:ascii="Arial" w:hAnsi="Arial"/>
+                <w:b w:val="0"/>
+                <w:sz w:val="19"/>
+              </w:rPr>
+              <w:t>3. O sistema recalcula a reputação de quem foi avaliado.</w:t>
+            </w:r>
+          </w:p>
+          <w:p>
+            <w:pPr>
+              <w:keepNext/>
+              <w:spacing w:after="20" w:before="20" w:line="240" w:lineRule="auto"/>
+            </w:pPr>
+            <w:r>
+              <w:rPr>
+                <w:rFonts w:ascii="Arial" w:hAnsi="Arial"/>
+                <w:b w:val="0"/>
+                <w:sz w:val="19"/>
+              </w:rPr>
+              <w:t>4. O sistema registra a ação junto à denúncia e o fluxo volta para UC10.</w:t>
+            </w:r>
+          </w:p>
+        </w:tc>
+      </w:tr>
+      <w:tr>
+        <w:trPr>
+          <w:cantSplit/>
+        </w:trPr>
+        <w:tc>
+          <w:tcPr>
+            <w:tcW w:type="dxa" w:w="2948"/>
+            <w:shd w:val="clear" w:color="auto" w:fill="D9E8F5"/>
+          </w:tcPr>
+          <w:p>
+            <w:pPr>
+              <w:keepNext/>
+              <w:spacing w:after="20" w:before="20" w:line="240" w:lineRule="auto"/>
+            </w:pPr>
+            <w:r/>
+            <w:r>
+              <w:rPr>
+                <w:rFonts w:ascii="Arial" w:hAnsi="Arial"/>
+                <w:b/>
+                <w:sz w:val="19"/>
+              </w:rPr>
+              <w:t>Fluxos Alternativos</w:t>
+            </w:r>
+          </w:p>
+        </w:tc>
+        <w:tc>
+          <w:tcPr>
+            <w:tcW w:type="dxa" w:w="6123"/>
+          </w:tcPr>
+          <w:p>
+            <w:pPr>
+              <w:pStyle w:val="ListBullet"/>
+              <w:keepNext/>
+              <w:spacing w:after="20" w:before="20" w:line="240" w:lineRule="auto"/>
+            </w:pPr>
+            <w:r/>
+            <w:r>
+              <w:rPr>
+                <w:rFonts w:ascii="Arial" w:hAnsi="Arial"/>
+                <w:b w:val="0"/>
+                <w:sz w:val="19"/>
+              </w:rPr>
+              <w:t>A1. O administrador decide manter a avaliação; nada é alterado.</w:t>
+            </w:r>
+          </w:p>
+        </w:tc>
+      </w:tr>
+      <w:tr>
+        <w:trPr>
+          <w:cantSplit/>
+        </w:trPr>
+        <w:tc>
+          <w:tcPr>
+            <w:tcW w:type="dxa" w:w="2948"/>
+            <w:shd w:val="clear" w:color="auto" w:fill="D9E8F5"/>
+          </w:tcPr>
+          <w:p>
+            <w:pPr>
+              <w:keepNext/>
+              <w:spacing w:after="20" w:before="20" w:line="240" w:lineRule="auto"/>
+            </w:pPr>
+            <w:r/>
+            <w:r>
+              <w:rPr>
+                <w:rFonts w:ascii="Arial" w:hAnsi="Arial"/>
+                <w:b/>
+                <w:sz w:val="19"/>
+              </w:rPr>
+              <w:t>Fluxos de Exceção</w:t>
+            </w:r>
+          </w:p>
+        </w:tc>
+        <w:tc>
+          <w:tcPr>
+            <w:tcW w:type="dxa" w:w="6123"/>
+          </w:tcPr>
+          <w:p>
+            <w:pPr>
+              <w:pStyle w:val="ListBullet"/>
+              <w:keepNext/>
+              <w:spacing w:after="20" w:before="20" w:line="240" w:lineRule="auto"/>
+            </w:pPr>
+            <w:r/>
+            <w:r>
+              <w:rPr>
+                <w:rFonts w:ascii="Arial" w:hAnsi="Arial"/>
+                <w:b w:val="0"/>
+                <w:sz w:val="19"/>
+              </w:rPr>
+              <w:t>E1. A avaliação já foi removida: o sistema informa e não repete a ação.</w:t>
+            </w:r>
+          </w:p>
+        </w:tc>
+      </w:tr>
+      <w:tr>
+        <w:trPr>
+          <w:cantSplit/>
+        </w:trPr>
+        <w:tc>
+          <w:tcPr>
+            <w:tcW w:type="dxa" w:w="2948"/>
+            <w:shd w:val="clear" w:color="auto" w:fill="D9E8F5"/>
+          </w:tcPr>
+          <w:p>
+            <w:pPr>
+              <w:keepNext/>
+              <w:spacing w:after="20" w:before="20" w:line="240" w:lineRule="auto"/>
+            </w:pPr>
+            <w:r/>
+            <w:r>
+              <w:rPr>
+                <w:rFonts w:ascii="Arial" w:hAnsi="Arial"/>
+                <w:b/>
+                <w:sz w:val="19"/>
+              </w:rPr>
+              <w:t>Pós-condições</w:t>
+            </w:r>
+          </w:p>
+        </w:tc>
+        <w:tc>
+          <w:tcPr>
+            <w:tcW w:type="dxa" w:w="6123"/>
+          </w:tcPr>
+          <w:p>
+            <w:pPr>
+              <w:pStyle w:val="ListBullet"/>
+              <w:keepNext/>
+              <w:spacing w:after="20" w:before="20" w:line="240" w:lineRule="auto"/>
+            </w:pPr>
+            <w:r/>
+            <w:r>
+              <w:rPr>
+                <w:rFonts w:ascii="Arial" w:hAnsi="Arial"/>
+                <w:b w:val="0"/>
+                <w:sz w:val="19"/>
+              </w:rPr>
+              <w:t>A avaliação deixa de aparecer no perfil e de contar na média.</w:t>
+            </w:r>
+          </w:p>
+        </w:tc>
+      </w:tr>
+      <w:tr>
+        <w:trPr>
+          <w:cantSplit/>
+        </w:trPr>
+        <w:tc>
+          <w:tcPr>
+            <w:tcW w:type="dxa" w:w="2948"/>
+            <w:shd w:val="clear" w:color="auto" w:fill="D9E8F5"/>
+          </w:tcPr>
+          <w:p>
+            <w:pPr>
+              <w:keepNext/>
+              <w:spacing w:after="20" w:before="20" w:line="240" w:lineRule="auto"/>
+            </w:pPr>
+            <w:r/>
+            <w:r>
+              <w:rPr>
+                <w:rFonts w:ascii="Arial" w:hAnsi="Arial"/>
+                <w:b/>
+                <w:sz w:val="19"/>
+              </w:rPr>
+              <w:t>Critérios de Aceite</w:t>
+            </w:r>
+          </w:p>
+        </w:tc>
+        <w:tc>
+          <w:tcPr>
+            <w:tcW w:type="dxa" w:w="6123"/>
+          </w:tcPr>
+          <w:p>
+            <w:pPr>
+              <w:pStyle w:val="ListBullet"/>
+              <w:keepNext/>
+              <w:spacing w:after="20" w:before="20" w:line="240" w:lineRule="auto"/>
+            </w:pPr>
+            <w:r/>
+            <w:r>
+              <w:rPr>
+                <w:rFonts w:ascii="Arial" w:hAnsi="Arial"/>
+                <w:b w:val="0"/>
+                <w:sz w:val="19"/>
+              </w:rPr>
+              <w:t>A avaliação removida continua guardada para auditoria.</w:t>
+            </w:r>
+          </w:p>
+          <w:p>
+            <w:pPr>
+              <w:pStyle w:val="ListBullet"/>
+              <w:keepNext/>
+              <w:spacing w:after="20" w:before="20" w:line="240" w:lineRule="auto"/>
+            </w:pPr>
+            <w:r>
+              <w:rPr>
+                <w:rFonts w:ascii="Arial" w:hAnsi="Arial"/>
+                <w:b w:val="0"/>
+                <w:sz w:val="19"/>
+              </w:rPr>
+              <w:t>A média e a quantidade de avaliações são atualizadas na hora.</w:t>
+            </w:r>
+          </w:p>
+        </w:tc>
+      </w:tr>
+      <w:tr>
+        <w:trPr>
+          <w:cantSplit/>
+        </w:trPr>
+        <w:tc>
+          <w:tcPr>
+            <w:tcW w:type="dxa" w:w="2948"/>
+            <w:shd w:val="clear" w:color="auto" w:fill="D9E8F5"/>
+          </w:tcPr>
+          <w:p>
+            <w:pPr>
+              <w:spacing w:after="20" w:before="20" w:line="240" w:lineRule="auto"/>
+            </w:pPr>
+            <w:r/>
+            <w:r>
+              <w:rPr>
+                <w:rFonts w:ascii="Arial" w:hAnsi="Arial"/>
+                <w:b/>
+                <w:sz w:val="19"/>
+              </w:rPr>
+              <w:t>Requisitos e regras relacionados</w:t>
+            </w:r>
+          </w:p>
+        </w:tc>
+        <w:tc>
+          <w:tcPr>
+            <w:tcW w:type="dxa" w:w="6123"/>
+          </w:tcPr>
+          <w:p>
+            <w:pPr>
+              <w:spacing w:after="20" w:before="20" w:line="240" w:lineRule="auto"/>
+            </w:pPr>
+            <w:r/>
+            <w:r>
+              <w:rPr>
+                <w:rFonts w:ascii="Arial" w:hAnsi="Arial"/>
+                <w:b w:val="0"/>
+                <w:sz w:val="19"/>
+              </w:rPr>
+              <w:t>RF25, RF28; RN21-RN22</w:t>
+            </w:r>
+          </w:p>
+        </w:tc>
+      </w:tr>
+    </w:tbl>
+    <w:p>
+      <w:pPr>
+        <w:pStyle w:val="Heading3"/>
+      </w:pPr>
+      <w:r>
+        <w:t>UC16 - Suspender conta</w:t>
+      </w:r>
+    </w:p>
+    <w:tbl>
+      <w:tblPr>
+        <w:tblW w:type="auto" w:w="0"/>
+        <w:jc w:val="center"/>
+        <w:tblLayout w:type="fixed"/>
+        <w:tblLook w:firstColumn="1" w:firstRow="1" w:lastColumn="0" w:lastRow="0" w:noHBand="0" w:noVBand="1" w:val="04A0"/>
+        <w:tblBorders>
+          <w:top w:val="single" w:sz="8" w:color="000000"/>
+          <w:left w:val="single" w:sz="8" w:color="000000"/>
+          <w:bottom w:val="single" w:sz="8" w:color="000000"/>
+          <w:right w:val="single" w:sz="8" w:color="000000"/>
+          <w:insideH w:val="single" w:sz="8" w:color="000000"/>
+          <w:insideV w:val="single" w:sz="8" w:color="000000"/>
+        </w:tblBorders>
+      </w:tblPr>
+      <w:tblGrid>
+        <w:gridCol w:w="2948"/>
+        <w:gridCol w:w="6123"/>
+      </w:tblGrid>
+      <w:tr>
+        <w:trPr>
+          <w:cantSplit/>
+        </w:trPr>
+        <w:tc>
+          <w:tcPr>
+            <w:tcW w:type="dxa" w:w="2948"/>
+            <w:shd w:val="clear" w:color="auto" w:fill="D9E8F5"/>
+          </w:tcPr>
+          <w:p>
+            <w:pPr>
+              <w:keepNext/>
+              <w:spacing w:after="20" w:before="20" w:line="240" w:lineRule="auto"/>
+            </w:pPr>
+            <w:r/>
+            <w:r>
+              <w:rPr>
+                <w:rFonts w:ascii="Arial" w:hAnsi="Arial"/>
+                <w:b/>
+                <w:sz w:val="19"/>
+              </w:rPr>
+              <w:t>Caso de Uso</w:t>
+            </w:r>
+          </w:p>
+        </w:tc>
+        <w:tc>
+          <w:tcPr>
+            <w:tcW w:type="dxa" w:w="6123"/>
+            <w:shd w:val="clear" w:color="auto" w:fill="D9E8F5"/>
+          </w:tcPr>
+          <w:p>
+            <w:pPr>
+              <w:keepNext/>
+              <w:spacing w:after="20" w:before="20" w:line="240" w:lineRule="auto"/>
+            </w:pPr>
+            <w:r/>
+            <w:r>
+              <w:rPr>
+                <w:rFonts w:ascii="Arial" w:hAnsi="Arial"/>
+                <w:b/>
+                <w:sz w:val="19"/>
+              </w:rPr>
+              <w:t>UC16 - Suspender conta</w:t>
+            </w:r>
+          </w:p>
+        </w:tc>
+      </w:tr>
+      <w:tr>
+        <w:trPr>
+          <w:cantSplit/>
+        </w:trPr>
+        <w:tc>
+          <w:tcPr>
+            <w:tcW w:type="dxa" w:w="2948"/>
+            <w:shd w:val="clear" w:color="auto" w:fill="D9E8F5"/>
+          </w:tcPr>
+          <w:p>
+            <w:pPr>
+              <w:keepNext/>
+              <w:spacing w:after="20" w:before="20" w:line="240" w:lineRule="auto"/>
+            </w:pPr>
+            <w:r/>
+            <w:r>
+              <w:rPr>
+                <w:rFonts w:ascii="Arial" w:hAnsi="Arial"/>
+                <w:b/>
+                <w:sz w:val="19"/>
+              </w:rPr>
+              <w:t>Ator(es)</w:t>
+            </w:r>
+          </w:p>
+        </w:tc>
+        <w:tc>
+          <w:tcPr>
+            <w:tcW w:type="dxa" w:w="6123"/>
+          </w:tcPr>
+          <w:p>
+            <w:pPr>
+              <w:keepNext/>
+              <w:spacing w:after="20" w:before="20" w:line="240" w:lineRule="auto"/>
+            </w:pPr>
+            <w:r/>
+            <w:r>
+              <w:rPr>
+                <w:rFonts w:ascii="Arial" w:hAnsi="Arial"/>
+                <w:b w:val="0"/>
+                <w:sz w:val="19"/>
+              </w:rPr>
+              <w:t>Administrador (a partir de UC10)</w:t>
+            </w:r>
+          </w:p>
+        </w:tc>
+      </w:tr>
+      <w:tr>
+        <w:trPr>
+          <w:cantSplit/>
+        </w:trPr>
+        <w:tc>
+          <w:tcPr>
+            <w:tcW w:type="dxa" w:w="2948"/>
+            <w:shd w:val="clear" w:color="auto" w:fill="D9E8F5"/>
+          </w:tcPr>
+          <w:p>
+            <w:pPr>
+              <w:keepNext/>
+              <w:spacing w:after="20" w:before="20" w:line="240" w:lineRule="auto"/>
+            </w:pPr>
+            <w:r/>
+            <w:r>
+              <w:rPr>
+                <w:rFonts w:ascii="Arial" w:hAnsi="Arial"/>
+                <w:b/>
+                <w:sz w:val="19"/>
+              </w:rPr>
+              <w:t>História de usuário</w:t>
+            </w:r>
+          </w:p>
+        </w:tc>
+        <w:tc>
+          <w:tcPr>
+            <w:tcW w:type="dxa" w:w="6123"/>
+          </w:tcPr>
+          <w:p>
+            <w:pPr>
+              <w:keepNext/>
+              <w:spacing w:after="20" w:before="20" w:line="240" w:lineRule="auto"/>
+            </w:pPr>
+            <w:r/>
+            <w:r>
+              <w:rPr>
+                <w:rFonts w:ascii="Arial" w:hAnsi="Arial"/>
+                <w:b w:val="0"/>
+                <w:sz w:val="19"/>
+              </w:rPr>
+              <w:t>Como administrador, quero suspender a conta de quem descumpriu as regras, para proteger os demais estudantes.</w:t>
+            </w:r>
+          </w:p>
+        </w:tc>
+      </w:tr>
+      <w:tr>
+        <w:trPr>
+          <w:cantSplit/>
+        </w:trPr>
+        <w:tc>
+          <w:tcPr>
+            <w:tcW w:type="dxa" w:w="2948"/>
+            <w:shd w:val="clear" w:color="auto" w:fill="D9E8F5"/>
+          </w:tcPr>
+          <w:p>
+            <w:pPr>
+              <w:keepNext/>
+              <w:spacing w:after="20" w:before="20" w:line="240" w:lineRule="auto"/>
+            </w:pPr>
+            <w:r/>
+            <w:r>
+              <w:rPr>
+                <w:rFonts w:ascii="Arial" w:hAnsi="Arial"/>
+                <w:b/>
+                <w:sz w:val="19"/>
+              </w:rPr>
+              <w:t>Pré-requisitos</w:t>
+            </w:r>
+          </w:p>
+        </w:tc>
+        <w:tc>
+          <w:tcPr>
+            <w:tcW w:type="dxa" w:w="6123"/>
+          </w:tcPr>
+          <w:p>
+            <w:pPr>
+              <w:pStyle w:val="ListBullet"/>
+              <w:keepNext/>
+              <w:spacing w:after="20" w:before="20" w:line="240" w:lineRule="auto"/>
+            </w:pPr>
+            <w:r/>
+            <w:r>
+              <w:rPr>
+                <w:rFonts w:ascii="Arial" w:hAnsi="Arial"/>
+                <w:b w:val="0"/>
+                <w:sz w:val="19"/>
+              </w:rPr>
+              <w:t>Em UC10 Julgar denúncia, uma denúncia contra um usuário ou uma carona foi julgada procedente (condição do ponto de extensão).</w:t>
+            </w:r>
+          </w:p>
+        </w:tc>
+      </w:tr>
+      <w:tr>
+        <w:trPr>
+          <w:cantSplit/>
+        </w:trPr>
+        <w:tc>
+          <w:tcPr>
+            <w:tcW w:type="dxa" w:w="2948"/>
+            <w:shd w:val="clear" w:color="auto" w:fill="D9E8F5"/>
+          </w:tcPr>
+          <w:p>
+            <w:pPr>
+              <w:keepNext/>
+              <w:spacing w:after="20" w:before="20" w:line="240" w:lineRule="auto"/>
+            </w:pPr>
+            <w:r/>
+            <w:r>
+              <w:rPr>
+                <w:rFonts w:ascii="Arial" w:hAnsi="Arial"/>
+                <w:b/>
+                <w:sz w:val="19"/>
+              </w:rPr>
+              <w:t>Fluxo Principal</w:t>
+            </w:r>
+          </w:p>
+        </w:tc>
+        <w:tc>
+          <w:tcPr>
+            <w:tcW w:type="dxa" w:w="6123"/>
+          </w:tcPr>
+          <w:p>
+            <w:pPr>
+              <w:keepNext/>
+              <w:spacing w:after="20" w:before="20" w:line="240" w:lineRule="auto"/>
+            </w:pPr>
+            <w:r/>
+            <w:r>
+              <w:rPr>
+                <w:rFonts w:ascii="Arial" w:hAnsi="Arial"/>
+                <w:b w:val="0"/>
+                <w:sz w:val="19"/>
+              </w:rPr>
+              <w:t>1. O administrador escolhe suspender a conta responsável.</w:t>
+            </w:r>
+          </w:p>
+          <w:p>
+            <w:pPr>
+              <w:keepNext/>
+              <w:spacing w:after="20" w:before="20" w:line="240" w:lineRule="auto"/>
+            </w:pPr>
+            <w:r>
+              <w:rPr>
+                <w:rFonts w:ascii="Arial" w:hAnsi="Arial"/>
+                <w:b w:val="0"/>
+                <w:sz w:val="19"/>
+              </w:rPr>
+              <w:t>2. Informa o motivo e o prazo, ou indica suspensão sem prazo.</w:t>
+            </w:r>
+          </w:p>
+          <w:p>
+            <w:pPr>
+              <w:keepNext/>
+              <w:spacing w:after="20" w:before="20" w:line="240" w:lineRule="auto"/>
+            </w:pPr>
+            <w:r>
+              <w:rPr>
+                <w:rFonts w:ascii="Arial" w:hAnsi="Arial"/>
+                <w:b w:val="0"/>
+                <w:sz w:val="19"/>
+              </w:rPr>
+              <w:t>3. O sistema bloqueia o acesso da conta.</w:t>
+            </w:r>
+          </w:p>
+          <w:p>
+            <w:pPr>
+              <w:keepNext/>
+              <w:spacing w:after="20" w:before="20" w:line="240" w:lineRule="auto"/>
+            </w:pPr>
+            <w:r>
+              <w:rPr>
+                <w:rFonts w:ascii="Arial" w:hAnsi="Arial"/>
+                <w:b w:val="0"/>
+                <w:sz w:val="19"/>
+              </w:rPr>
+              <w:t>4. O sistema cancela as caronas futuras em que ela é motorista e as reservas dela, e notifica os participantes afetados.</w:t>
+            </w:r>
+          </w:p>
+          <w:p>
+            <w:pPr>
+              <w:keepNext/>
+              <w:spacing w:after="20" w:before="20" w:line="240" w:lineRule="auto"/>
+            </w:pPr>
+            <w:r>
+              <w:rPr>
+                <w:rFonts w:ascii="Arial" w:hAnsi="Arial"/>
+                <w:b w:val="0"/>
+                <w:sz w:val="19"/>
+              </w:rPr>
+              <w:t>5. O sistema registra a ação junto à denúncia e o fluxo volta para UC10.</w:t>
+            </w:r>
+          </w:p>
+        </w:tc>
+      </w:tr>
+      <w:tr>
+        <w:trPr>
+          <w:cantSplit/>
+        </w:trPr>
+        <w:tc>
+          <w:tcPr>
+            <w:tcW w:type="dxa" w:w="2948"/>
+            <w:shd w:val="clear" w:color="auto" w:fill="D9E8F5"/>
+          </w:tcPr>
+          <w:p>
+            <w:pPr>
+              <w:keepNext/>
+              <w:spacing w:after="20" w:before="20" w:line="240" w:lineRule="auto"/>
+            </w:pPr>
+            <w:r/>
+            <w:r>
+              <w:rPr>
+                <w:rFonts w:ascii="Arial" w:hAnsi="Arial"/>
+                <w:b/>
+                <w:sz w:val="19"/>
+              </w:rPr>
+              <w:t>Fluxos Alternativos</w:t>
+            </w:r>
+          </w:p>
+        </w:tc>
+        <w:tc>
+          <w:tcPr>
+            <w:tcW w:type="dxa" w:w="6123"/>
+          </w:tcPr>
+          <w:p>
+            <w:pPr>
+              <w:pStyle w:val="ListBullet"/>
+              <w:keepNext/>
+              <w:spacing w:after="20" w:before="20" w:line="240" w:lineRule="auto"/>
+            </w:pPr>
+            <w:r/>
+            <w:r>
+              <w:rPr>
+                <w:rFonts w:ascii="Arial" w:hAnsi="Arial"/>
+                <w:b w:val="0"/>
+                <w:sz w:val="19"/>
+              </w:rPr>
+              <w:t>A1. Ao fim do prazo, a conta volta a ter acesso automaticamente.</w:t>
+            </w:r>
+          </w:p>
+          <w:p>
+            <w:pPr>
+              <w:pStyle w:val="ListBullet"/>
+              <w:keepNext/>
+              <w:spacing w:after="20" w:before="20" w:line="240" w:lineRule="auto"/>
+            </w:pPr>
+            <w:r/>
+            <w:r>
+              <w:rPr>
+                <w:rFonts w:ascii="Arial" w:hAnsi="Arial"/>
+                <w:b w:val="0"/>
+                <w:sz w:val="19"/>
+              </w:rPr>
+              <w:t>A2. O administrador encerra a suspensão antes do prazo, com justificativa.</w:t>
+            </w:r>
+          </w:p>
+        </w:tc>
+      </w:tr>
+      <w:tr>
+        <w:trPr>
+          <w:cantSplit/>
+        </w:trPr>
+        <w:tc>
+          <w:tcPr>
+            <w:tcW w:type="dxa" w:w="2948"/>
+            <w:shd w:val="clear" w:color="auto" w:fill="D9E8F5"/>
+          </w:tcPr>
+          <w:p>
+            <w:pPr>
+              <w:keepNext/>
+              <w:spacing w:after="20" w:before="20" w:line="240" w:lineRule="auto"/>
+            </w:pPr>
+            <w:r/>
+            <w:r>
+              <w:rPr>
+                <w:rFonts w:ascii="Arial" w:hAnsi="Arial"/>
+                <w:b/>
+                <w:sz w:val="19"/>
+              </w:rPr>
+              <w:t>Fluxos de Exceção</w:t>
+            </w:r>
+          </w:p>
+        </w:tc>
+        <w:tc>
+          <w:tcPr>
+            <w:tcW w:type="dxa" w:w="6123"/>
+          </w:tcPr>
+          <w:p>
+            <w:pPr>
+              <w:pStyle w:val="ListBullet"/>
+              <w:keepNext/>
+              <w:spacing w:after="20" w:before="20" w:line="240" w:lineRule="auto"/>
+            </w:pPr>
+            <w:r/>
+            <w:r>
+              <w:rPr>
+                <w:rFonts w:ascii="Arial" w:hAnsi="Arial"/>
+                <w:b w:val="0"/>
+                <w:sz w:val="19"/>
+              </w:rPr>
+              <w:t>E1. A conta é de um administrador: a suspensão não é permitida por esta tela.</w:t>
+            </w:r>
+          </w:p>
+          <w:p>
+            <w:pPr>
+              <w:pStyle w:val="ListBullet"/>
+              <w:keepNext/>
+              <w:spacing w:after="20" w:before="20" w:line="240" w:lineRule="auto"/>
+            </w:pPr>
+            <w:r>
+              <w:rPr>
+                <w:rFonts w:ascii="Arial" w:hAnsi="Arial"/>
+                <w:b w:val="0"/>
+                <w:sz w:val="19"/>
+              </w:rPr>
+              <w:t>E2. Motivo vazio: a suspensão não é aplicada.</w:t>
+            </w:r>
+          </w:p>
+        </w:tc>
+      </w:tr>
+      <w:tr>
+        <w:trPr>
+          <w:cantSplit/>
+        </w:trPr>
+        <w:tc>
+          <w:tcPr>
+            <w:tcW w:type="dxa" w:w="2948"/>
+            <w:shd w:val="clear" w:color="auto" w:fill="D9E8F5"/>
+          </w:tcPr>
+          <w:p>
+            <w:pPr>
+              <w:keepNext/>
+              <w:spacing w:after="20" w:before="20" w:line="240" w:lineRule="auto"/>
+            </w:pPr>
+            <w:r/>
+            <w:r>
+              <w:rPr>
+                <w:rFonts w:ascii="Arial" w:hAnsi="Arial"/>
+                <w:b/>
+                <w:sz w:val="19"/>
+              </w:rPr>
+              <w:t>Pós-condições</w:t>
+            </w:r>
+          </w:p>
+        </w:tc>
+        <w:tc>
+          <w:tcPr>
+            <w:tcW w:type="dxa" w:w="6123"/>
+          </w:tcPr>
+          <w:p>
+            <w:pPr>
+              <w:pStyle w:val="ListBullet"/>
+              <w:keepNext/>
+              <w:spacing w:after="20" w:before="20" w:line="240" w:lineRule="auto"/>
+            </w:pPr>
+            <w:r/>
+            <w:r>
+              <w:rPr>
+                <w:rFonts w:ascii="Arial" w:hAnsi="Arial"/>
+                <w:b w:val="0"/>
+                <w:sz w:val="19"/>
+              </w:rPr>
+              <w:t>A conta fica sem acesso durante a suspensão e os participantes afetados são avisados.</w:t>
+            </w:r>
+          </w:p>
+        </w:tc>
+      </w:tr>
+      <w:tr>
+        <w:trPr>
+          <w:cantSplit/>
+        </w:trPr>
+        <w:tc>
+          <w:tcPr>
+            <w:tcW w:type="dxa" w:w="2948"/>
+            <w:shd w:val="clear" w:color="auto" w:fill="D9E8F5"/>
+          </w:tcPr>
+          <w:p>
+            <w:pPr>
+              <w:keepNext/>
+              <w:spacing w:after="20" w:before="20" w:line="240" w:lineRule="auto"/>
+            </w:pPr>
+            <w:r/>
+            <w:r>
+              <w:rPr>
+                <w:rFonts w:ascii="Arial" w:hAnsi="Arial"/>
+                <w:b/>
+                <w:sz w:val="19"/>
+              </w:rPr>
+              <w:t>Critérios de Aceite</w:t>
+            </w:r>
+          </w:p>
+        </w:tc>
+        <w:tc>
+          <w:tcPr>
+            <w:tcW w:type="dxa" w:w="6123"/>
+          </w:tcPr>
+          <w:p>
+            <w:pPr>
+              <w:pStyle w:val="ListBullet"/>
+              <w:keepNext/>
+              <w:spacing w:after="20" w:before="20" w:line="240" w:lineRule="auto"/>
+            </w:pPr>
+            <w:r/>
+            <w:r>
+              <w:rPr>
+                <w:rFonts w:ascii="Arial" w:hAnsi="Arial"/>
+                <w:b w:val="0"/>
+                <w:sz w:val="19"/>
+              </w:rPr>
+              <w:t>A conta suspensa não consegue entrar, mesmo com o SUAP válido.</w:t>
+            </w:r>
+          </w:p>
+          <w:p>
+            <w:pPr>
+              <w:pStyle w:val="ListBullet"/>
+              <w:keepNext/>
+              <w:spacing w:after="20" w:before="20" w:line="240" w:lineRule="auto"/>
+            </w:pPr>
+            <w:r>
+              <w:rPr>
+                <w:rFonts w:ascii="Arial" w:hAnsi="Arial"/>
+                <w:b w:val="0"/>
+                <w:sz w:val="19"/>
+              </w:rPr>
+              <w:t>Caronas e reservas futuras da conta são canceladas com notificação.</w:t>
+            </w:r>
+          </w:p>
+          <w:p>
+            <w:pPr>
+              <w:pStyle w:val="ListBullet"/>
+              <w:keepNext/>
+              <w:spacing w:after="20" w:before="20" w:line="240" w:lineRule="auto"/>
+            </w:pPr>
+            <w:r>
+              <w:rPr>
+                <w:rFonts w:ascii="Arial" w:hAnsi="Arial"/>
+                <w:b w:val="0"/>
+                <w:sz w:val="19"/>
+              </w:rPr>
+              <w:t>Toda suspensão tem motivo registrado.</w:t>
+            </w:r>
+          </w:p>
+        </w:tc>
+      </w:tr>
+      <w:tr>
+        <w:trPr>
+          <w:cantSplit/>
+        </w:trPr>
+        <w:tc>
+          <w:tcPr>
+            <w:tcW w:type="dxa" w:w="2948"/>
+            <w:shd w:val="clear" w:color="auto" w:fill="D9E8F5"/>
+          </w:tcPr>
+          <w:p>
+            <w:pPr>
+              <w:spacing w:after="20" w:before="20" w:line="240" w:lineRule="auto"/>
+            </w:pPr>
+            <w:r/>
+            <w:r>
+              <w:rPr>
+                <w:rFonts w:ascii="Arial" w:hAnsi="Arial"/>
+                <w:b/>
+                <w:sz w:val="19"/>
+              </w:rPr>
+              <w:t>Requisitos e regras relacionados</w:t>
+            </w:r>
+          </w:p>
+        </w:tc>
+        <w:tc>
+          <w:tcPr>
+            <w:tcW w:type="dxa" w:w="6123"/>
+          </w:tcPr>
+          <w:p>
+            <w:pPr>
+              <w:spacing w:after="20" w:before="20" w:line="240" w:lineRule="auto"/>
+            </w:pPr>
+            <w:r/>
+            <w:r>
+              <w:rPr>
+                <w:rFonts w:ascii="Arial" w:hAnsi="Arial"/>
+                <w:b w:val="0"/>
+                <w:sz w:val="19"/>
+              </w:rPr>
+              <w:t>RF07, RF18, RF21, RF29; RN22-RN23</w:t>
             </w:r>
           </w:p>
         </w:tc>
@@ -15403,7 +17947,7 @@
                 <w:b w:val="0"/>
                 <w:sz w:val="19"/>
               </w:rPr>
-              <w:t>RF05, RF09-RF10, RF12</w:t>
+              <w:t>RF05, RF09</w:t>
             </w:r>
           </w:p>
         </w:tc>
@@ -15422,7 +17966,7 @@
                 <w:b w:val="0"/>
                 <w:sz w:val="19"/>
               </w:rPr>
-              <w:t>RN04-RN06, RN17-RN18</w:t>
+              <w:t>RN04-RN06, RN18</w:t>
             </w:r>
           </w:p>
         </w:tc>
@@ -15760,7 +18304,7 @@
                 <w:b w:val="0"/>
                 <w:sz w:val="19"/>
               </w:rPr>
-              <w:t>RF06-RF08, RF11-RF12, RF21</w:t>
+              <w:t>RF06-RF08, RF21</w:t>
             </w:r>
           </w:p>
         </w:tc>
@@ -15779,7 +18323,7 @@
                 <w:b w:val="0"/>
                 <w:sz w:val="19"/>
               </w:rPr>
-              <w:t>RN04, RN13-RN15, RN17</w:t>
+              <w:t>RN04, RN13-RN15</w:t>
             </w:r>
           </w:p>
         </w:tc>
@@ -16217,7 +18761,7 @@
                 <w:b w:val="0"/>
                 <w:sz w:val="19"/>
               </w:rPr>
-              <w:t>Analisar denúncias</w:t>
+              <w:t>Julgar denúncia</w:t>
             </w:r>
           </w:p>
         </w:tc>
@@ -16255,7 +18799,7 @@
                 <w:b w:val="0"/>
                 <w:sz w:val="19"/>
               </w:rPr>
-              <w:t>RN21-RN22</w:t>
+              <w:t>RN22</w:t>
             </w:r>
           </w:p>
         </w:tc>
@@ -16532,6 +19076,482 @@
                 <w:sz w:val="19"/>
               </w:rPr>
               <w:t>5</w:t>
+            </w:r>
+          </w:p>
+        </w:tc>
+      </w:tr>
+      <w:tr>
+        <w:trPr>
+          <w:cantSplit/>
+        </w:trPr>
+        <w:tc>
+          <w:tcPr>
+            <w:tcW w:type="dxa" w:w="907"/>
+          </w:tcPr>
+          <w:p>
+            <w:pPr>
+              <w:spacing w:after="20" w:before="20" w:line="240" w:lineRule="auto"/>
+            </w:pPr>
+            <w:r/>
+            <w:r>
+              <w:rPr>
+                <w:rFonts w:ascii="Arial" w:hAnsi="Arial"/>
+                <w:b w:val="0"/>
+                <w:sz w:val="19"/>
+              </w:rPr>
+              <w:t>UC13</w:t>
+            </w:r>
+          </w:p>
+        </w:tc>
+        <w:tc>
+          <w:tcPr>
+            <w:tcW w:type="dxa" w:w="2041"/>
+          </w:tcPr>
+          <w:p>
+            <w:pPr>
+              <w:spacing w:after="20" w:before="20" w:line="240" w:lineRule="auto"/>
+            </w:pPr>
+            <w:r/>
+            <w:r>
+              <w:rPr>
+                <w:rFonts w:ascii="Arial" w:hAnsi="Arial"/>
+                <w:b w:val="0"/>
+                <w:sz w:val="19"/>
+              </w:rPr>
+              <w:t>Calcular rota</w:t>
+            </w:r>
+          </w:p>
+        </w:tc>
+        <w:tc>
+          <w:tcPr>
+            <w:tcW w:type="dxa" w:w="2041"/>
+          </w:tcPr>
+          <w:p>
+            <w:pPr>
+              <w:spacing w:after="20" w:before="20" w:line="240" w:lineRule="auto"/>
+            </w:pPr>
+            <w:r/>
+            <w:r>
+              <w:rPr>
+                <w:rFonts w:ascii="Arial" w:hAnsi="Arial"/>
+                <w:b w:val="0"/>
+                <w:sz w:val="19"/>
+              </w:rPr>
+              <w:t>RF09-RF10, RF12</w:t>
+            </w:r>
+          </w:p>
+        </w:tc>
+        <w:tc>
+          <w:tcPr>
+            <w:tcW w:type="dxa" w:w="1984"/>
+          </w:tcPr>
+          <w:p>
+            <w:pPr>
+              <w:spacing w:after="20" w:before="20" w:line="240" w:lineRule="auto"/>
+            </w:pPr>
+            <w:r/>
+            <w:r>
+              <w:rPr>
+                <w:rFonts w:ascii="Arial" w:hAnsi="Arial"/>
+                <w:b w:val="0"/>
+                <w:sz w:val="19"/>
+              </w:rPr>
+              <w:t>RN17-RN18</w:t>
+            </w:r>
+          </w:p>
+        </w:tc>
+        <w:tc>
+          <w:tcPr>
+            <w:tcW w:type="dxa" w:w="1247"/>
+          </w:tcPr>
+          <w:p>
+            <w:pPr>
+              <w:spacing w:after="20" w:before="20" w:line="240" w:lineRule="auto"/>
+            </w:pPr>
+            <w:r/>
+            <w:r>
+              <w:rPr>
+                <w:rFonts w:ascii="Arial" w:hAnsi="Arial"/>
+                <w:b w:val="0"/>
+                <w:sz w:val="19"/>
+              </w:rPr>
+              <w:t>Deveria ter</w:t>
+            </w:r>
+          </w:p>
+        </w:tc>
+        <w:tc>
+          <w:tcPr>
+            <w:tcW w:type="dxa" w:w="850"/>
+          </w:tcPr>
+          <w:p>
+            <w:pPr>
+              <w:spacing w:after="20" w:before="20" w:line="240" w:lineRule="auto"/>
+            </w:pPr>
+            <w:r/>
+            <w:r>
+              <w:rPr>
+                <w:rFonts w:ascii="Arial" w:hAnsi="Arial"/>
+                <w:b w:val="0"/>
+                <w:sz w:val="19"/>
+              </w:rPr>
+              <w:t>2 e 4</w:t>
+            </w:r>
+          </w:p>
+        </w:tc>
+      </w:tr>
+      <w:tr>
+        <w:trPr>
+          <w:cantSplit/>
+        </w:trPr>
+        <w:tc>
+          <w:tcPr>
+            <w:tcW w:type="dxa" w:w="907"/>
+          </w:tcPr>
+          <w:p>
+            <w:pPr>
+              <w:spacing w:after="20" w:before="20" w:line="240" w:lineRule="auto"/>
+            </w:pPr>
+            <w:r/>
+            <w:r>
+              <w:rPr>
+                <w:rFonts w:ascii="Arial" w:hAnsi="Arial"/>
+                <w:b w:val="0"/>
+                <w:sz w:val="19"/>
+              </w:rPr>
+              <w:t>UC14</w:t>
+            </w:r>
+          </w:p>
+        </w:tc>
+        <w:tc>
+          <w:tcPr>
+            <w:tcW w:type="dxa" w:w="2041"/>
+          </w:tcPr>
+          <w:p>
+            <w:pPr>
+              <w:spacing w:after="20" w:before="20" w:line="240" w:lineRule="auto"/>
+            </w:pPr>
+            <w:r/>
+            <w:r>
+              <w:rPr>
+                <w:rFonts w:ascii="Arial" w:hAnsi="Arial"/>
+                <w:b w:val="0"/>
+                <w:sz w:val="19"/>
+              </w:rPr>
+              <w:t>Recalcular rota</w:t>
+            </w:r>
+          </w:p>
+        </w:tc>
+        <w:tc>
+          <w:tcPr>
+            <w:tcW w:type="dxa" w:w="2041"/>
+          </w:tcPr>
+          <w:p>
+            <w:pPr>
+              <w:spacing w:after="20" w:before="20" w:line="240" w:lineRule="auto"/>
+            </w:pPr>
+            <w:r/>
+            <w:r>
+              <w:rPr>
+                <w:rFonts w:ascii="Arial" w:hAnsi="Arial"/>
+                <w:b w:val="0"/>
+                <w:sz w:val="19"/>
+              </w:rPr>
+              <w:t>RF11-RF12, RF21</w:t>
+            </w:r>
+          </w:p>
+        </w:tc>
+        <w:tc>
+          <w:tcPr>
+            <w:tcW w:type="dxa" w:w="1984"/>
+          </w:tcPr>
+          <w:p>
+            <w:pPr>
+              <w:spacing w:after="20" w:before="20" w:line="240" w:lineRule="auto"/>
+            </w:pPr>
+            <w:r/>
+            <w:r>
+              <w:rPr>
+                <w:rFonts w:ascii="Arial" w:hAnsi="Arial"/>
+                <w:b w:val="0"/>
+                <w:sz w:val="19"/>
+              </w:rPr>
+              <w:t>RN14, RN17</w:t>
+            </w:r>
+          </w:p>
+        </w:tc>
+        <w:tc>
+          <w:tcPr>
+            <w:tcW w:type="dxa" w:w="1247"/>
+          </w:tcPr>
+          <w:p>
+            <w:pPr>
+              <w:spacing w:after="20" w:before="20" w:line="240" w:lineRule="auto"/>
+            </w:pPr>
+            <w:r/>
+            <w:r>
+              <w:rPr>
+                <w:rFonts w:ascii="Arial" w:hAnsi="Arial"/>
+                <w:b w:val="0"/>
+                <w:sz w:val="19"/>
+              </w:rPr>
+              <w:t>Deveria ter</w:t>
+            </w:r>
+          </w:p>
+        </w:tc>
+        <w:tc>
+          <w:tcPr>
+            <w:tcW w:type="dxa" w:w="850"/>
+          </w:tcPr>
+          <w:p>
+            <w:pPr>
+              <w:spacing w:after="20" w:before="20" w:line="240" w:lineRule="auto"/>
+            </w:pPr>
+            <w:r/>
+            <w:r>
+              <w:rPr>
+                <w:rFonts w:ascii="Arial" w:hAnsi="Arial"/>
+                <w:b w:val="0"/>
+                <w:sz w:val="19"/>
+              </w:rPr>
+              <w:t>4</w:t>
+            </w:r>
+          </w:p>
+        </w:tc>
+      </w:tr>
+      <w:tr>
+        <w:trPr>
+          <w:cantSplit/>
+        </w:trPr>
+        <w:tc>
+          <w:tcPr>
+            <w:tcW w:type="dxa" w:w="907"/>
+          </w:tcPr>
+          <w:p>
+            <w:pPr>
+              <w:spacing w:after="20" w:before="20" w:line="240" w:lineRule="auto"/>
+            </w:pPr>
+            <w:r/>
+            <w:r>
+              <w:rPr>
+                <w:rFonts w:ascii="Arial" w:hAnsi="Arial"/>
+                <w:b w:val="0"/>
+                <w:sz w:val="19"/>
+              </w:rPr>
+              <w:t>UC15</w:t>
+            </w:r>
+          </w:p>
+        </w:tc>
+        <w:tc>
+          <w:tcPr>
+            <w:tcW w:type="dxa" w:w="2041"/>
+          </w:tcPr>
+          <w:p>
+            <w:pPr>
+              <w:spacing w:after="20" w:before="20" w:line="240" w:lineRule="auto"/>
+            </w:pPr>
+            <w:r/>
+            <w:r>
+              <w:rPr>
+                <w:rFonts w:ascii="Arial" w:hAnsi="Arial"/>
+                <w:b w:val="0"/>
+                <w:sz w:val="19"/>
+              </w:rPr>
+              <w:t>Remover avaliação</w:t>
+            </w:r>
+          </w:p>
+        </w:tc>
+        <w:tc>
+          <w:tcPr>
+            <w:tcW w:type="dxa" w:w="2041"/>
+          </w:tcPr>
+          <w:p>
+            <w:pPr>
+              <w:spacing w:after="20" w:before="20" w:line="240" w:lineRule="auto"/>
+            </w:pPr>
+            <w:r/>
+            <w:r>
+              <w:rPr>
+                <w:rFonts w:ascii="Arial" w:hAnsi="Arial"/>
+                <w:b w:val="0"/>
+                <w:sz w:val="19"/>
+              </w:rPr>
+              <w:t>RF25, RF28</w:t>
+            </w:r>
+          </w:p>
+        </w:tc>
+        <w:tc>
+          <w:tcPr>
+            <w:tcW w:type="dxa" w:w="1984"/>
+          </w:tcPr>
+          <w:p>
+            <w:pPr>
+              <w:spacing w:after="20" w:before="20" w:line="240" w:lineRule="auto"/>
+            </w:pPr>
+            <w:r/>
+            <w:r>
+              <w:rPr>
+                <w:rFonts w:ascii="Arial" w:hAnsi="Arial"/>
+                <w:b w:val="0"/>
+                <w:sz w:val="19"/>
+              </w:rPr>
+              <w:t>RN21-RN22</w:t>
+            </w:r>
+          </w:p>
+        </w:tc>
+        <w:tc>
+          <w:tcPr>
+            <w:tcW w:type="dxa" w:w="1247"/>
+          </w:tcPr>
+          <w:p>
+            <w:pPr>
+              <w:spacing w:after="20" w:before="20" w:line="240" w:lineRule="auto"/>
+            </w:pPr>
+            <w:r/>
+            <w:r>
+              <w:rPr>
+                <w:rFonts w:ascii="Arial" w:hAnsi="Arial"/>
+                <w:b w:val="0"/>
+                <w:sz w:val="19"/>
+              </w:rPr>
+              <w:t>Poderia ter</w:t>
+            </w:r>
+          </w:p>
+        </w:tc>
+        <w:tc>
+          <w:tcPr>
+            <w:tcW w:type="dxa" w:w="850"/>
+          </w:tcPr>
+          <w:p>
+            <w:pPr>
+              <w:spacing w:after="20" w:before="20" w:line="240" w:lineRule="auto"/>
+            </w:pPr>
+            <w:r/>
+            <w:r>
+              <w:rPr>
+                <w:rFonts w:ascii="Arial" w:hAnsi="Arial"/>
+                <w:b w:val="0"/>
+                <w:sz w:val="19"/>
+              </w:rPr>
+              <w:t>6</w:t>
+            </w:r>
+          </w:p>
+        </w:tc>
+      </w:tr>
+      <w:tr>
+        <w:trPr>
+          <w:cantSplit/>
+        </w:trPr>
+        <w:tc>
+          <w:tcPr>
+            <w:tcW w:type="dxa" w:w="907"/>
+          </w:tcPr>
+          <w:p>
+            <w:pPr>
+              <w:spacing w:after="20" w:before="20" w:line="240" w:lineRule="auto"/>
+            </w:pPr>
+            <w:r/>
+            <w:r>
+              <w:rPr>
+                <w:rFonts w:ascii="Arial" w:hAnsi="Arial"/>
+                <w:b w:val="0"/>
+                <w:sz w:val="19"/>
+              </w:rPr>
+              <w:t>UC16</w:t>
+            </w:r>
+          </w:p>
+        </w:tc>
+        <w:tc>
+          <w:tcPr>
+            <w:tcW w:type="dxa" w:w="2041"/>
+          </w:tcPr>
+          <w:p>
+            <w:pPr>
+              <w:spacing w:after="20" w:before="20" w:line="240" w:lineRule="auto"/>
+            </w:pPr>
+            <w:r/>
+            <w:r>
+              <w:rPr>
+                <w:rFonts w:ascii="Arial" w:hAnsi="Arial"/>
+                <w:b w:val="0"/>
+                <w:sz w:val="19"/>
+              </w:rPr>
+              <w:t>Suspender conta</w:t>
+            </w:r>
+          </w:p>
+        </w:tc>
+        <w:tc>
+          <w:tcPr>
+            <w:tcW w:type="dxa" w:w="2041"/>
+          </w:tcPr>
+          <w:p>
+            <w:pPr>
+              <w:spacing w:after="20" w:before="20" w:line="240" w:lineRule="auto"/>
+            </w:pPr>
+            <w:r/>
+            <w:r>
+              <w:rPr>
+                <w:rFonts w:ascii="Arial" w:hAnsi="Arial"/>
+                <w:b w:val="0"/>
+                <w:sz w:val="19"/>
+              </w:rPr>
+              <w:t>RF29</w:t>
+            </w:r>
+          </w:p>
+        </w:tc>
+        <w:tc>
+          <w:tcPr>
+            <w:tcW w:type="dxa" w:w="1984"/>
+          </w:tcPr>
+          <w:p>
+            <w:pPr>
+              <w:spacing w:after="20" w:before="20" w:line="240" w:lineRule="auto"/>
+            </w:pPr>
+            <w:r/>
+            <w:r>
+              <w:rPr>
+                <w:rFonts w:ascii="Arial" w:hAnsi="Arial"/>
+                <w:b w:val="0"/>
+                <w:sz w:val="19"/>
+              </w:rPr>
+              <w:t>RN22-RN23</w:t>
+            </w:r>
+          </w:p>
+        </w:tc>
+        <w:tc>
+          <w:tcPr>
+            <w:tcW w:type="dxa" w:w="1247"/>
+          </w:tcPr>
+          <w:p>
+            <w:pPr>
+              <w:spacing w:after="20" w:before="20" w:line="240" w:lineRule="auto"/>
+            </w:pPr>
+            <w:r/>
+            <w:r>
+              <w:rPr>
+                <w:rFonts w:ascii="Arial" w:hAnsi="Arial"/>
+                <w:b w:val="0"/>
+                <w:sz w:val="19"/>
+              </w:rPr>
+              <w:t>Poderia ter</w:t>
+            </w:r>
+          </w:p>
+        </w:tc>
+        <w:tc>
+          <w:tcPr>
+            <w:tcW w:type="dxa" w:w="850"/>
+          </w:tcPr>
+          <w:p>
+            <w:pPr>
+              <w:spacing w:after="20" w:before="20" w:line="240" w:lineRule="auto"/>
+            </w:pPr>
+            <w:r/>
+            <w:r>
+              <w:rPr>
+                <w:rFonts w:ascii="Arial" w:hAnsi="Arial"/>
+                <w:b w:val="0"/>
+                <w:sz w:val="19"/>
+              </w:rPr>
+              <w:t>6</w:t>
             </w:r>
           </w:p>
         </w:tc>
@@ -16547,7 +19567,7 @@
         <w:jc w:val="both"/>
       </w:pPr>
       <w:r>
-        <w:t>UC06 aparece nas etapas 3 e 4 porque concluir a carona (RF08) faz parte do fluxo principal, enquanto editar e cancelar (RF06 e RF07) ficam para a etapa 4.</w:t>
+        <w:t>UC06 aparece nas etapas 3 e 4 porque concluir a carona (RF08) faz parte do fluxo principal, enquanto editar e cancelar (RF06 e RF07) ficam para a etapa 4. UC13 aparece nas etapas 2 e 4 porque, por ser incluído em UC03, já existe na etapa 2 registrando os endereços informados (RF09), e passa a consultar o Google Maps na etapa 4 (RF10).</w:t>
       </w:r>
     </w:p>
     <w:sectPr>

</xml_diff>

<commit_message>
docs: liga o administrador direto a avaliações e contas
UC01 passa a se chamar Autenticar e os casos de uso aparecem sem o código no diagrama. UC15 Administrar avaliações e UC16 Administrar contas deixam de estender UC10 e se associam direto ao Administrador; o extend fica só em Recalcular rota.
</commit_message>
<xml_diff>
--- a/docs/documento-tecnico.docx
+++ b/docs/documento-tecnico.docx
@@ -4741,7 +4741,7 @@
                 <w:b w:val="0"/>
                 <w:sz w:val="19"/>
               </w:rPr>
-              <w:t>Permitir que o administrador remova uma avaliação considerada indevida, retirando-a do perfil e do cálculo da reputação.</w:t>
+              <w:t>Permitir que o administrador consulte as avaliações e remova ou restaure uma avaliação, com justificativa; a avaliação removida sai do perfil e do cálculo da reputação.</w:t>
             </w:r>
           </w:p>
         </w:tc>
@@ -4822,7 +4822,7 @@
                 <w:b w:val="0"/>
                 <w:sz w:val="19"/>
               </w:rPr>
-              <w:t>Permitir que o administrador suspenda a conta de um estudante, informando o motivo e, quando houver, o prazo da suspensão.</w:t>
+              <w:t>Permitir que o administrador consulte as contas e suspenda ou reative a conta de um estudante, informando o motivo e, quando houver, o prazo da suspensão.</w:t>
             </w:r>
           </w:p>
         </w:tc>
@@ -7550,7 +7550,7 @@
       <w:r>
         <w:drawing>
           <wp:inline xmlns:a="http://schemas.openxmlformats.org/drawingml/2006/main" xmlns:pic="http://schemas.openxmlformats.org/drawingml/2006/picture">
-            <wp:extent cx="5760000" cy="7200000"/>
+            <wp:extent cx="5760000" cy="7612800"/>
             <wp:docPr id="1" name="Picture 1"/>
             <wp:cNvGraphicFramePr>
               <a:graphicFrameLocks noChangeAspect="1"/>
@@ -7563,7 +7563,7 @@
                     <pic:cNvPicPr/>
                   </pic:nvPicPr>
                   <pic:blipFill>
-                    <a:blip r:embed="rId10"/>
+                    <a:blip r:embed="rId11"/>
                     <a:stretch>
                       <a:fillRect/>
                     </a:stretch>
@@ -7571,7 +7571,7 @@
                   <pic:spPr>
                     <a:xfrm>
                       <a:off x="0" y="0"/>
-                      <a:ext cx="5760000" cy="7200000"/>
+                      <a:ext cx="5760000" cy="7612800"/>
                     </a:xfrm>
                     <a:prstGeom prst="rect"/>
                   </pic:spPr>
@@ -7611,7 +7611,7 @@
         <w:jc w:val="both"/>
       </w:pPr>
       <w:r>
-        <w:t>«include» indica um comportamento que sempre faz parte do caso base: publicar uma carona (UC03) sempre calcula a rota (UC13). «extend» indica um comportamento opcional, que só acontece quando a condição do ponto de extensão do caso base é atendida: UC14 Recalcular rota estende UC06 Atualizar carona quando um local muda, e UC15 Remover avaliação e UC16 Suspender conta estendem UC10 Julgar denúncia quando a denúncia procede. A seta vai do caso que inclui para o incluído e do caso que estende para o caso base. O Google Maps se associa só aos casos que o consultam (UC13 e UC14) e fornece dados geográficos; as decisões de publicação, reserva e edição permanecem no BoraJunto.</w:t>
+        <w:t>«include» indica um comportamento que sempre faz parte do caso base: publicar uma carona (UC03) sempre calcula a rota (UC13). «extend» indica um comportamento opcional, que só acontece quando a condição do ponto de extensão do caso base é atendida: UC14 Recalcular rota estende UC06 Atualizar carona quando um local muda. A seta vai do caso que inclui para o incluído e do caso que estende para o caso base. O Google Maps se associa só aos casos que o consultam (UC13 e UC14) e fornece dados geográficos; as decisões de publicação, reserva e edição permanecem no BoraJunto.</w:t>
       </w:r>
     </w:p>
     <w:p>
@@ -7619,7 +7619,7 @@
         <w:jc w:val="both"/>
       </w:pPr>
       <w:r>
-        <w:t>Os números dos casos de uso são fixos. UC11 e UC12 surgiram ao separar objetivos que estavam juntos em UC06 e UC07, e UC13 a UC16 ao destacar o cálculo da rota e as medidas de moderação; por isso aparecem no fim da numeração.</w:t>
+        <w:t>O Administrador se associa diretamente a UC10 Julgar denúncia, UC15 Administrar avaliações e UC16 Administrar contas. Cada um é um objetivo próprio, que ele pode iniciar a qualquer momento, com ou sem uma denúncia em andamento. Os números dos casos de uso são fixos: UC11 e UC12 surgiram ao separar objetivos que estavam juntos em UC06 e UC07, e UC13 a UC16 ao destacar o cálculo da rota e a administração, por isso aparecem no fim da numeração.</w:t>
       </w:r>
     </w:p>
     <w:p>
@@ -7643,7 +7643,7 @@
         <w:pStyle w:val="Heading3"/>
       </w:pPr>
       <w:r>
-        <w:t>UC01 - Autenticar estudante</w:t>
+        <w:t>UC01 - Autenticar</w:t>
       </w:r>
     </w:p>
     <w:tbl>
@@ -7707,7 +7707,7 @@
                 <w:b/>
                 <w:sz w:val="19"/>
               </w:rPr>
-              <w:t>UC01 - Autenticar estudante</w:t>
+              <w:t>UC01 - Autenticar</w:t>
             </w:r>
           </w:p>
         </w:tc>
@@ -13599,7 +13599,7 @@
                 <w:b w:val="0"/>
                 <w:sz w:val="19"/>
               </w:rPr>
-              <w:t>5. Ponto de extensão "aplicar medida": se a denúncia procede, pode ocorrer UC15 Remover avaliação ou UC16 Suspender conta («extend»).</w:t>
+              <w:t>5. Se a denúncia procede, o administrador aplica a medida em UC15 Administrar avaliações ou UC16 Administrar contas.</w:t>
             </w:r>
           </w:p>
           <w:p>
@@ -13906,7 +13906,7 @@
                 <w:b w:val="0"/>
                 <w:sz w:val="19"/>
               </w:rPr>
-              <w:t>Julgar não aplica medidas sozinho: remover avaliação e suspender conta são passos separados.</w:t>
+              <w:t>Julgar não aplica medidas sozinho: remover avaliações e suspender contas são feitos em UC15 e UC16.</w:t>
             </w:r>
           </w:p>
         </w:tc>
@@ -16333,7 +16333,7 @@
         <w:pStyle w:val="Heading3"/>
       </w:pPr>
       <w:r>
-        <w:t>UC15 - Remover avaliação</w:t>
+        <w:t>UC15 - Administrar avaliações</w:t>
       </w:r>
     </w:p>
     <w:tbl>
@@ -16397,7 +16397,7 @@
                 <w:b/>
                 <w:sz w:val="19"/>
               </w:rPr>
-              <w:t>UC15 - Remover avaliação</w:t>
+              <w:t>UC15 - Administrar avaliações</w:t>
             </w:r>
           </w:p>
         </w:tc>
@@ -16443,7 +16443,7 @@
                 <w:b w:val="0"/>
                 <w:sz w:val="19"/>
               </w:rPr>
-              <w:t>Administrador (a partir de UC10)</w:t>
+              <w:t>Administrador</w:t>
             </w:r>
           </w:p>
         </w:tc>
@@ -16489,7 +16489,7 @@
                 <w:b w:val="0"/>
                 <w:sz w:val="19"/>
               </w:rPr>
-              <w:t>Como administrador, quero remover uma avaliação considerada indevida, para que ela não distorça a reputação de quem foi avaliado.</w:t>
+              <w:t>Como administrador, quero consultar as avaliações e remover as indevidas, para que a reputação reflita só avaliações legítimas.</w:t>
             </w:r>
           </w:p>
         </w:tc>
@@ -16536,7 +16536,7 @@
                 <w:b w:val="0"/>
                 <w:sz w:val="19"/>
               </w:rPr>
-              <w:t>Em UC10 Julgar denúncia, uma denúncia sobre uma avaliação foi julgada procedente (condição do ponto de extensão).</w:t>
+              <w:t>O administrador está autenticado e autorizado no Django Admin.</w:t>
             </w:r>
           </w:p>
         </w:tc>
@@ -16582,49 +16582,63 @@
                 <w:b w:val="0"/>
                 <w:sz w:val="19"/>
               </w:rPr>
-              <w:t>1. O administrador escolhe remover a avaliação denunciada.</w:t>
-            </w:r>
-          </w:p>
-          <w:p>
-            <w:pPr>
-              <w:keepNext/>
-              <w:spacing w:after="20" w:before="20" w:line="240" w:lineRule="auto"/>
-            </w:pPr>
-            <w:r>
-              <w:rPr>
-                <w:rFonts w:ascii="Arial" w:hAnsi="Arial"/>
-                <w:b w:val="0"/>
-                <w:sz w:val="19"/>
-              </w:rPr>
-              <w:t>2. O sistema marca a avaliação como removida, sem apagá-la do banco.</w:t>
-            </w:r>
-          </w:p>
-          <w:p>
-            <w:pPr>
-              <w:keepNext/>
-              <w:spacing w:after="20" w:before="20" w:line="240" w:lineRule="auto"/>
-            </w:pPr>
-            <w:r>
-              <w:rPr>
-                <w:rFonts w:ascii="Arial" w:hAnsi="Arial"/>
-                <w:b w:val="0"/>
-                <w:sz w:val="19"/>
-              </w:rPr>
-              <w:t>3. O sistema recalcula a reputação de quem foi avaliado.</w:t>
-            </w:r>
-          </w:p>
-          <w:p>
-            <w:pPr>
-              <w:keepNext/>
-              <w:spacing w:after="20" w:before="20" w:line="240" w:lineRule="auto"/>
-            </w:pPr>
-            <w:r>
-              <w:rPr>
-                <w:rFonts w:ascii="Arial" w:hAnsi="Arial"/>
-                <w:b w:val="0"/>
-                <w:sz w:val="19"/>
-              </w:rPr>
-              <w:t>4. O sistema registra a ação junto à denúncia e o fluxo volta para UC10.</w:t>
+              <w:t>1. O administrador abre a lista de avaliações, podendo filtrar por avaliado, nota ou denúncia.</w:t>
+            </w:r>
+          </w:p>
+          <w:p>
+            <w:pPr>
+              <w:keepNext/>
+              <w:spacing w:after="20" w:before="20" w:line="240" w:lineRule="auto"/>
+            </w:pPr>
+            <w:r>
+              <w:rPr>
+                <w:rFonts w:ascii="Arial" w:hAnsi="Arial"/>
+                <w:b w:val="0"/>
+                <w:sz w:val="19"/>
+              </w:rPr>
+              <w:t>2. Seleciona uma avaliação; o sistema mostra a nota, o autor, o avaliado, a carona e as denúncias ligadas a ela.</w:t>
+            </w:r>
+          </w:p>
+          <w:p>
+            <w:pPr>
+              <w:keepNext/>
+              <w:spacing w:after="20" w:before="20" w:line="240" w:lineRule="auto"/>
+            </w:pPr>
+            <w:r>
+              <w:rPr>
+                <w:rFonts w:ascii="Arial" w:hAnsi="Arial"/>
+                <w:b w:val="0"/>
+                <w:sz w:val="19"/>
+              </w:rPr>
+              <w:t>3. O administrador remove a avaliação e informa a justificativa.</w:t>
+            </w:r>
+          </w:p>
+          <w:p>
+            <w:pPr>
+              <w:keepNext/>
+              <w:spacing w:after="20" w:before="20" w:line="240" w:lineRule="auto"/>
+            </w:pPr>
+            <w:r>
+              <w:rPr>
+                <w:rFonts w:ascii="Arial" w:hAnsi="Arial"/>
+                <w:b w:val="0"/>
+                <w:sz w:val="19"/>
+              </w:rPr>
+              <w:t>4. O sistema marca a avaliação como removida, sem apagá-la, e recalcula a reputação do avaliado.</w:t>
+            </w:r>
+          </w:p>
+          <w:p>
+            <w:pPr>
+              <w:keepNext/>
+              <w:spacing w:after="20" w:before="20" w:line="240" w:lineRule="auto"/>
+            </w:pPr>
+            <w:r>
+              <w:rPr>
+                <w:rFonts w:ascii="Arial" w:hAnsi="Arial"/>
+                <w:b w:val="0"/>
+                <w:sz w:val="19"/>
+              </w:rPr>
+              <w:t>5. O sistema registra a ação administrativa.</w:t>
             </w:r>
           </w:p>
         </w:tc>
@@ -16671,7 +16685,7 @@
                 <w:b w:val="0"/>
                 <w:sz w:val="19"/>
               </w:rPr>
-              <w:t>A1. O administrador decide manter a avaliação; nada é alterado.</w:t>
+              <w:t>A1. O administrador restaura uma avaliação removida por engano, com justificativa; a reputação é recalculada.</w:t>
             </w:r>
           </w:p>
         </w:tc>
@@ -16718,7 +16732,23 @@
                 <w:b w:val="0"/>
                 <w:sz w:val="19"/>
               </w:rPr>
-              <w:t>E1. A avaliação já foi removida: o sistema informa e não repete a ação.</w:t>
+              <w:t>E1. Usuário sem autorização: o acesso é negado.</w:t>
+            </w:r>
+          </w:p>
+          <w:p>
+            <w:pPr>
+              <w:pStyle w:val="ListBullet"/>
+              <w:keepNext/>
+              <w:spacing w:after="20" w:before="20" w:line="240" w:lineRule="auto"/>
+            </w:pPr>
+            <w:r/>
+            <w:r>
+              <w:rPr>
+                <w:rFonts w:ascii="Arial" w:hAnsi="Arial"/>
+                <w:b w:val="0"/>
+                <w:sz w:val="19"/>
+              </w:rPr>
+              <w:t>E2. Justificativa vazia: a avaliação não é removida.</w:t>
             </w:r>
           </w:p>
         </w:tc>
@@ -16765,7 +16795,7 @@
                 <w:b w:val="0"/>
                 <w:sz w:val="19"/>
               </w:rPr>
-              <w:t>A avaliação deixa de aparecer no perfil e de contar na média.</w:t>
+              <w:t>A avaliação removida deixa de aparecer no perfil e de contar na média.</w:t>
             </w:r>
           </w:p>
         </w:tc>
@@ -16830,6 +16860,21 @@
               <w:t>A média e a quantidade de avaliações são atualizadas na hora.</w:t>
             </w:r>
           </w:p>
+          <w:p>
+            <w:pPr>
+              <w:pStyle w:val="ListBullet"/>
+              <w:keepNext/>
+              <w:spacing w:after="20" w:before="20" w:line="240" w:lineRule="auto"/>
+            </w:pPr>
+            <w:r>
+              <w:rPr>
+                <w:rFonts w:ascii="Arial" w:hAnsi="Arial"/>
+                <w:b w:val="0"/>
+                <w:sz w:val="19"/>
+              </w:rPr>
+              <w:t>Toda remoção ou restauração tem justificativa.</w:t>
+            </w:r>
+          </w:p>
         </w:tc>
       </w:tr>
       <w:tr>
@@ -16871,7 +16916,7 @@
                 <w:b w:val="0"/>
                 <w:sz w:val="19"/>
               </w:rPr>
-              <w:t>RF25, RF28; RN21-RN22</w:t>
+              <w:t>RF25, RF28; RN21-RN22; RNF12</w:t>
             </w:r>
           </w:p>
         </w:tc>
@@ -16882,7 +16927,7 @@
         <w:pStyle w:val="Heading3"/>
       </w:pPr>
       <w:r>
-        <w:t>UC16 - Suspender conta</w:t>
+        <w:t>UC16 - Administrar contas</w:t>
       </w:r>
     </w:p>
     <w:tbl>
@@ -16946,7 +16991,7 @@
                 <w:b/>
                 <w:sz w:val="19"/>
               </w:rPr>
-              <w:t>UC16 - Suspender conta</w:t>
+              <w:t>UC16 - Administrar contas</w:t>
             </w:r>
           </w:p>
         </w:tc>
@@ -16992,7 +17037,7 @@
                 <w:b w:val="0"/>
                 <w:sz w:val="19"/>
               </w:rPr>
-              <w:t>Administrador (a partir de UC10)</w:t>
+              <w:t>Administrador</w:t>
             </w:r>
           </w:p>
         </w:tc>
@@ -17038,7 +17083,7 @@
                 <w:b w:val="0"/>
                 <w:sz w:val="19"/>
               </w:rPr>
-              <w:t>Como administrador, quero suspender a conta de quem descumpriu as regras, para proteger os demais estudantes.</w:t>
+              <w:t>Como administrador, quero consultar as contas e suspender ou reativar estudantes, para proteger a comunidade de quem descumpre as regras.</w:t>
             </w:r>
           </w:p>
         </w:tc>
@@ -17085,7 +17130,7 @@
                 <w:b w:val="0"/>
                 <w:sz w:val="19"/>
               </w:rPr>
-              <w:t>Em UC10 Julgar denúncia, uma denúncia contra um usuário ou uma carona foi julgada procedente (condição do ponto de extensão).</w:t>
+              <w:t>O administrador está autenticado e autorizado no Django Admin.</w:t>
             </w:r>
           </w:p>
         </w:tc>
@@ -17131,63 +17176,63 @@
                 <w:b w:val="0"/>
                 <w:sz w:val="19"/>
               </w:rPr>
-              <w:t>1. O administrador escolhe suspender a conta responsável.</w:t>
-            </w:r>
-          </w:p>
-          <w:p>
-            <w:pPr>
-              <w:keepNext/>
-              <w:spacing w:after="20" w:before="20" w:line="240" w:lineRule="auto"/>
-            </w:pPr>
-            <w:r>
-              <w:rPr>
-                <w:rFonts w:ascii="Arial" w:hAnsi="Arial"/>
-                <w:b w:val="0"/>
-                <w:sz w:val="19"/>
-              </w:rPr>
-              <w:t>2. Informa o motivo e o prazo, ou indica suspensão sem prazo.</w:t>
-            </w:r>
-          </w:p>
-          <w:p>
-            <w:pPr>
-              <w:keepNext/>
-              <w:spacing w:after="20" w:before="20" w:line="240" w:lineRule="auto"/>
-            </w:pPr>
-            <w:r>
-              <w:rPr>
-                <w:rFonts w:ascii="Arial" w:hAnsi="Arial"/>
-                <w:b w:val="0"/>
-                <w:sz w:val="19"/>
-              </w:rPr>
-              <w:t>3. O sistema bloqueia o acesso da conta.</w:t>
-            </w:r>
-          </w:p>
-          <w:p>
-            <w:pPr>
-              <w:keepNext/>
-              <w:spacing w:after="20" w:before="20" w:line="240" w:lineRule="auto"/>
-            </w:pPr>
-            <w:r>
-              <w:rPr>
-                <w:rFonts w:ascii="Arial" w:hAnsi="Arial"/>
-                <w:b w:val="0"/>
-                <w:sz w:val="19"/>
-              </w:rPr>
-              <w:t>4. O sistema cancela as caronas futuras em que ela é motorista e as reservas dela, e notifica os participantes afetados.</w:t>
-            </w:r>
-          </w:p>
-          <w:p>
-            <w:pPr>
-              <w:keepNext/>
-              <w:spacing w:after="20" w:before="20" w:line="240" w:lineRule="auto"/>
-            </w:pPr>
-            <w:r>
-              <w:rPr>
-                <w:rFonts w:ascii="Arial" w:hAnsi="Arial"/>
-                <w:b w:val="0"/>
-                <w:sz w:val="19"/>
-              </w:rPr>
-              <w:t>5. O sistema registra a ação junto à denúncia e o fluxo volta para UC10.</w:t>
+              <w:t>1. O administrador abre a lista de contas, podendo filtrar por nome, matrícula ou situação.</w:t>
+            </w:r>
+          </w:p>
+          <w:p>
+            <w:pPr>
+              <w:keepNext/>
+              <w:spacing w:after="20" w:before="20" w:line="240" w:lineRule="auto"/>
+            </w:pPr>
+            <w:r>
+              <w:rPr>
+                <w:rFonts w:ascii="Arial" w:hAnsi="Arial"/>
+                <w:b w:val="0"/>
+                <w:sz w:val="19"/>
+              </w:rPr>
+              <w:t>2. Seleciona uma conta; o sistema mostra os dados do SUAP, a reputação, as caronas e as denúncias ligadas a ela.</w:t>
+            </w:r>
+          </w:p>
+          <w:p>
+            <w:pPr>
+              <w:keepNext/>
+              <w:spacing w:after="20" w:before="20" w:line="240" w:lineRule="auto"/>
+            </w:pPr>
+            <w:r>
+              <w:rPr>
+                <w:rFonts w:ascii="Arial" w:hAnsi="Arial"/>
+                <w:b w:val="0"/>
+                <w:sz w:val="19"/>
+              </w:rPr>
+              <w:t>3. O administrador suspende a conta, informando o motivo e o prazo, ou indica suspensão sem prazo.</w:t>
+            </w:r>
+          </w:p>
+          <w:p>
+            <w:pPr>
+              <w:keepNext/>
+              <w:spacing w:after="20" w:before="20" w:line="240" w:lineRule="auto"/>
+            </w:pPr>
+            <w:r>
+              <w:rPr>
+                <w:rFonts w:ascii="Arial" w:hAnsi="Arial"/>
+                <w:b w:val="0"/>
+                <w:sz w:val="19"/>
+              </w:rPr>
+              <w:t>4. O sistema bloqueia o acesso da conta, cancela as caronas futuras em que ela é motorista e as reservas dela, e notifica os participantes afetados.</w:t>
+            </w:r>
+          </w:p>
+          <w:p>
+            <w:pPr>
+              <w:keepNext/>
+              <w:spacing w:after="20" w:before="20" w:line="240" w:lineRule="auto"/>
+            </w:pPr>
+            <w:r>
+              <w:rPr>
+                <w:rFonts w:ascii="Arial" w:hAnsi="Arial"/>
+                <w:b w:val="0"/>
+                <w:sz w:val="19"/>
+              </w:rPr>
+              <w:t>5. O sistema registra a ação administrativa.</w:t>
             </w:r>
           </w:p>
         </w:tc>
@@ -17250,7 +17295,7 @@
                 <w:b w:val="0"/>
                 <w:sz w:val="19"/>
               </w:rPr>
-              <w:t>A2. O administrador encerra a suspensão antes do prazo, com justificativa.</w:t>
+              <w:t>A2. O administrador reativa a conta antes do prazo, com justificativa.</w:t>
             </w:r>
           </w:p>
         </w:tc>
@@ -17297,7 +17342,7 @@
                 <w:b w:val="0"/>
                 <w:sz w:val="19"/>
               </w:rPr>
-              <w:t>E1. A conta é de um administrador: a suspensão não é permitida por esta tela.</w:t>
+              <w:t>E1. Usuário sem autorização: o acesso é negado.</w:t>
             </w:r>
           </w:p>
           <w:p>
@@ -17312,7 +17357,22 @@
                 <w:b w:val="0"/>
                 <w:sz w:val="19"/>
               </w:rPr>
-              <w:t>E2. Motivo vazio: a suspensão não é aplicada.</w:t>
+              <w:t>E2. A conta é de um administrador: a suspensão não é permitida por esta tela.</w:t>
+            </w:r>
+          </w:p>
+          <w:p>
+            <w:pPr>
+              <w:pStyle w:val="ListBullet"/>
+              <w:keepNext/>
+              <w:spacing w:after="20" w:before="20" w:line="240" w:lineRule="auto"/>
+            </w:pPr>
+            <w:r>
+              <w:rPr>
+                <w:rFonts w:ascii="Arial" w:hAnsi="Arial"/>
+                <w:b w:val="0"/>
+                <w:sz w:val="19"/>
+              </w:rPr>
+              <w:t>E3. Motivo vazio: a suspensão não é aplicada.</w:t>
             </w:r>
           </w:p>
         </w:tc>
@@ -17436,7 +17496,7 @@
                 <w:b w:val="0"/>
                 <w:sz w:val="19"/>
               </w:rPr>
-              <w:t>Toda suspensão tem motivo registrado.</w:t>
+              <w:t>Toda suspensão e reativação tem motivo registrado.</w:t>
             </w:r>
           </w:p>
         </w:tc>
@@ -17480,7 +17540,7 @@
                 <w:b w:val="0"/>
                 <w:sz w:val="19"/>
               </w:rPr>
-              <w:t>RF07, RF18, RF21, RF29; RN22-RN23</w:t>
+              <w:t>RF07, RF18, RF21, RF29; RN22-RN23; RNF12</w:t>
             </w:r>
           </w:p>
         </w:tc>
@@ -17690,7 +17750,7 @@
                 <w:b w:val="0"/>
                 <w:sz w:val="19"/>
               </w:rPr>
-              <w:t>Autenticar estudante</w:t>
+              <w:t>Autenticar</w:t>
             </w:r>
           </w:p>
         </w:tc>
@@ -19356,7 +19416,7 @@
                 <w:b w:val="0"/>
                 <w:sz w:val="19"/>
               </w:rPr>
-              <w:t>Remover avaliação</w:t>
+              <w:t>Administrar avaliações</w:t>
             </w:r>
           </w:p>
         </w:tc>
@@ -19475,7 +19535,7 @@
                 <w:b w:val="0"/>
                 <w:sz w:val="19"/>
               </w:rPr>
-              <w:t>Suspender conta</w:t>
+              <w:t>Administrar contas</w:t>
             </w:r>
           </w:p>
         </w:tc>

</xml_diff>